<commit_message>
dokumentáció: bekezdés, tartalomjegyzék, felhasználói dokumentáció
</commit_message>
<xml_diff>
--- a/Dokumentáció.docx
+++ b/Dokumentáció.docx
@@ -29,16 +29,2980 @@
           <w:szCs w:val="36"/>
         </w:rPr>
         <w:br/>
-      </w:r>
-      <w:r>
+        <w:t>Dokumentáció</w:t>
+      </w:r>
+    </w:p>
+    <w:p>
+      <w:pPr>
+        <w:jc w:val="both"/>
+      </w:pPr>
+      <w:r>
+        <w:t xml:space="preserve">A dokumentáció első felében a </w:t>
+      </w:r>
+      <w:hyperlink w:anchor="_Felhasználói_dokumentáció" w:history="1">
+        <w:r>
+          <w:rPr>
+            <w:rStyle w:val="Hiperhivatkozs"/>
+          </w:rPr>
+          <w:t>felhasználói dok</w:t>
+        </w:r>
+        <w:r>
+          <w:rPr>
+            <w:rStyle w:val="Hiperhivatkozs"/>
+          </w:rPr>
+          <w:t>u</w:t>
+        </w:r>
+        <w:r>
+          <w:rPr>
+            <w:rStyle w:val="Hiperhivatkozs"/>
+          </w:rPr>
+          <w:t>mentáció</w:t>
+        </w:r>
+      </w:hyperlink>
+      <w:r>
+        <w:t xml:space="preserve"> található, amely bemutatja az alkalmazás működését. A második fele a </w:t>
+      </w:r>
+      <w:hyperlink w:anchor="_Fejlesztői_dokumentáció" w:history="1">
+        <w:r>
+          <w:rPr>
+            <w:rStyle w:val="Hiperhivatkozs"/>
+          </w:rPr>
+          <w:t xml:space="preserve">fejlesztői </w:t>
+        </w:r>
+        <w:r>
+          <w:rPr>
+            <w:rStyle w:val="Hiperhivatkozs"/>
+          </w:rPr>
+          <w:t>d</w:t>
+        </w:r>
+        <w:r>
+          <w:rPr>
+            <w:rStyle w:val="Hiperhivatkozs"/>
+          </w:rPr>
+          <w:t>okumentáció</w:t>
+        </w:r>
+      </w:hyperlink>
+      <w:r>
+        <w:t>, ahol a feladatokpontok megvalósításával kapcsolatos információk szerepelnek.</w:t>
+      </w:r>
+    </w:p>
+    <w:p>
+      <w:pPr>
+        <w:pBdr>
+          <w:bottom w:val="single" w:sz="4" w:space="1" w:color="auto"/>
+        </w:pBdr>
+        <w:spacing w:before="360"/>
         <w:rPr>
           <w:b/>
           <w:bCs/>
-          <w:sz w:val="36"/>
-          <w:szCs w:val="36"/>
-        </w:rPr>
-        <w:t>Dokumentáció</w:t>
-      </w:r>
+        </w:rPr>
+      </w:pPr>
+      <w:r>
+        <w:rPr>
+          <w:b/>
+          <w:bCs/>
+        </w:rPr>
+        <w:t>Tartalomjegyzék</w:t>
+      </w:r>
+    </w:p>
+    <w:p>
+      <w:pPr>
+        <w:pStyle w:val="TJ1"/>
+        <w:tabs>
+          <w:tab w:val="right" w:leader="dot" w:pos="9062"/>
+        </w:tabs>
+        <w:rPr>
+          <w:rFonts w:eastAsiaTheme="minorEastAsia"/>
+          <w:noProof/>
+          <w:lang w:eastAsia="hu-HU"/>
+        </w:rPr>
+      </w:pPr>
+      <w:r>
+        <w:fldChar w:fldCharType="begin"/>
+      </w:r>
+      <w:r>
+        <w:instrText xml:space="preserve"> TOC \o "1-3" \h \z \u </w:instrText>
+      </w:r>
+      <w:r>
+        <w:fldChar w:fldCharType="separate"/>
+      </w:r>
+      <w:hyperlink w:anchor="_Toc226466870" w:history="1">
+        <w:r>
+          <w:rPr>
+            <w:rStyle w:val="Hiperhivatkozs"/>
+            <w:noProof/>
+          </w:rPr>
+          <w:t>Felhasználói dokumentáció</w:t>
+        </w:r>
+        <w:r>
+          <w:rPr>
+            <w:noProof/>
+            <w:webHidden/>
+          </w:rPr>
+          <w:tab/>
+        </w:r>
+        <w:r>
+          <w:rPr>
+            <w:noProof/>
+            <w:webHidden/>
+          </w:rPr>
+          <w:fldChar w:fldCharType="begin"/>
+        </w:r>
+        <w:r>
+          <w:rPr>
+            <w:noProof/>
+            <w:webHidden/>
+          </w:rPr>
+          <w:instrText xml:space="preserve"> PAGEREF _Toc226466870 \h </w:instrText>
+        </w:r>
+        <w:r>
+          <w:rPr>
+            <w:noProof/>
+            <w:webHidden/>
+          </w:rPr>
+        </w:r>
+        <w:r>
+          <w:rPr>
+            <w:noProof/>
+            <w:webHidden/>
+          </w:rPr>
+          <w:fldChar w:fldCharType="separate"/>
+        </w:r>
+        <w:r>
+          <w:rPr>
+            <w:noProof/>
+            <w:webHidden/>
+          </w:rPr>
+          <w:t>2</w:t>
+        </w:r>
+        <w:r>
+          <w:rPr>
+            <w:noProof/>
+            <w:webHidden/>
+          </w:rPr>
+          <w:fldChar w:fldCharType="end"/>
+        </w:r>
+      </w:hyperlink>
+    </w:p>
+    <w:p>
+      <w:pPr>
+        <w:pStyle w:val="TJ2"/>
+        <w:tabs>
+          <w:tab w:val="right" w:leader="dot" w:pos="9062"/>
+        </w:tabs>
+        <w:rPr>
+          <w:rFonts w:eastAsiaTheme="minorEastAsia"/>
+          <w:noProof/>
+          <w:lang w:eastAsia="hu-HU"/>
+        </w:rPr>
+      </w:pPr>
+      <w:hyperlink w:anchor="_Toc226466871" w:history="1">
+        <w:r>
+          <w:rPr>
+            <w:rStyle w:val="Hiperhivatkozs"/>
+            <w:noProof/>
+          </w:rPr>
+          <w:t>Főoldal</w:t>
+        </w:r>
+        <w:r>
+          <w:rPr>
+            <w:noProof/>
+            <w:webHidden/>
+          </w:rPr>
+          <w:tab/>
+        </w:r>
+        <w:r>
+          <w:rPr>
+            <w:noProof/>
+            <w:webHidden/>
+          </w:rPr>
+          <w:fldChar w:fldCharType="begin"/>
+        </w:r>
+        <w:r>
+          <w:rPr>
+            <w:noProof/>
+            <w:webHidden/>
+          </w:rPr>
+          <w:instrText xml:space="preserve"> PAGEREF _Toc226466871 \h </w:instrText>
+        </w:r>
+        <w:r>
+          <w:rPr>
+            <w:noProof/>
+            <w:webHidden/>
+          </w:rPr>
+        </w:r>
+        <w:r>
+          <w:rPr>
+            <w:noProof/>
+            <w:webHidden/>
+          </w:rPr>
+          <w:fldChar w:fldCharType="separate"/>
+        </w:r>
+        <w:r>
+          <w:rPr>
+            <w:noProof/>
+            <w:webHidden/>
+          </w:rPr>
+          <w:t>2</w:t>
+        </w:r>
+        <w:r>
+          <w:rPr>
+            <w:noProof/>
+            <w:webHidden/>
+          </w:rPr>
+          <w:fldChar w:fldCharType="end"/>
+        </w:r>
+      </w:hyperlink>
+    </w:p>
+    <w:p>
+      <w:pPr>
+        <w:pStyle w:val="TJ2"/>
+        <w:tabs>
+          <w:tab w:val="right" w:leader="dot" w:pos="9062"/>
+        </w:tabs>
+        <w:rPr>
+          <w:rFonts w:eastAsiaTheme="minorEastAsia"/>
+          <w:noProof/>
+          <w:lang w:eastAsia="hu-HU"/>
+        </w:rPr>
+      </w:pPr>
+      <w:hyperlink w:anchor="_Toc226466872" w:history="1">
+        <w:r>
+          <w:rPr>
+            <w:rStyle w:val="Hiperhivatkozs"/>
+            <w:noProof/>
+          </w:rPr>
+          <w:t>JavaScript menü</w:t>
+        </w:r>
+        <w:r>
+          <w:rPr>
+            <w:noProof/>
+            <w:webHidden/>
+          </w:rPr>
+          <w:tab/>
+        </w:r>
+        <w:r>
+          <w:rPr>
+            <w:noProof/>
+            <w:webHidden/>
+          </w:rPr>
+          <w:fldChar w:fldCharType="begin"/>
+        </w:r>
+        <w:r>
+          <w:rPr>
+            <w:noProof/>
+            <w:webHidden/>
+          </w:rPr>
+          <w:instrText xml:space="preserve"> PAGEREF _Toc226466872 \h </w:instrText>
+        </w:r>
+        <w:r>
+          <w:rPr>
+            <w:noProof/>
+            <w:webHidden/>
+          </w:rPr>
+        </w:r>
+        <w:r>
+          <w:rPr>
+            <w:noProof/>
+            <w:webHidden/>
+          </w:rPr>
+          <w:fldChar w:fldCharType="separate"/>
+        </w:r>
+        <w:r>
+          <w:rPr>
+            <w:noProof/>
+            <w:webHidden/>
+          </w:rPr>
+          <w:t>3</w:t>
+        </w:r>
+        <w:r>
+          <w:rPr>
+            <w:noProof/>
+            <w:webHidden/>
+          </w:rPr>
+          <w:fldChar w:fldCharType="end"/>
+        </w:r>
+      </w:hyperlink>
+    </w:p>
+    <w:p>
+      <w:pPr>
+        <w:pStyle w:val="TJ2"/>
+        <w:tabs>
+          <w:tab w:val="right" w:leader="dot" w:pos="9062"/>
+        </w:tabs>
+        <w:rPr>
+          <w:rFonts w:eastAsiaTheme="minorEastAsia"/>
+          <w:noProof/>
+          <w:lang w:eastAsia="hu-HU"/>
+        </w:rPr>
+      </w:pPr>
+      <w:hyperlink w:anchor="_Toc226466873" w:history="1">
+        <w:r>
+          <w:rPr>
+            <w:rStyle w:val="Hiperhivatkozs"/>
+            <w:noProof/>
+          </w:rPr>
+          <w:t>React menü</w:t>
+        </w:r>
+        <w:r>
+          <w:rPr>
+            <w:noProof/>
+            <w:webHidden/>
+          </w:rPr>
+          <w:tab/>
+        </w:r>
+        <w:r>
+          <w:rPr>
+            <w:noProof/>
+            <w:webHidden/>
+          </w:rPr>
+          <w:fldChar w:fldCharType="begin"/>
+        </w:r>
+        <w:r>
+          <w:rPr>
+            <w:noProof/>
+            <w:webHidden/>
+          </w:rPr>
+          <w:instrText xml:space="preserve"> PAGEREF _Toc226466873 \h </w:instrText>
+        </w:r>
+        <w:r>
+          <w:rPr>
+            <w:noProof/>
+            <w:webHidden/>
+          </w:rPr>
+        </w:r>
+        <w:r>
+          <w:rPr>
+            <w:noProof/>
+            <w:webHidden/>
+          </w:rPr>
+          <w:fldChar w:fldCharType="separate"/>
+        </w:r>
+        <w:r>
+          <w:rPr>
+            <w:noProof/>
+            <w:webHidden/>
+          </w:rPr>
+          <w:t>4</w:t>
+        </w:r>
+        <w:r>
+          <w:rPr>
+            <w:noProof/>
+            <w:webHidden/>
+          </w:rPr>
+          <w:fldChar w:fldCharType="end"/>
+        </w:r>
+      </w:hyperlink>
+    </w:p>
+    <w:p>
+      <w:pPr>
+        <w:pStyle w:val="TJ2"/>
+        <w:tabs>
+          <w:tab w:val="right" w:leader="dot" w:pos="9062"/>
+        </w:tabs>
+        <w:rPr>
+          <w:rFonts w:eastAsiaTheme="minorEastAsia"/>
+          <w:noProof/>
+          <w:lang w:eastAsia="hu-HU"/>
+        </w:rPr>
+      </w:pPr>
+      <w:hyperlink w:anchor="_Toc226466874" w:history="1">
+        <w:r>
+          <w:rPr>
+            <w:rStyle w:val="Hiperhivatkozs"/>
+            <w:noProof/>
+          </w:rPr>
+          <w:t>SPA menü</w:t>
+        </w:r>
+        <w:r>
+          <w:rPr>
+            <w:noProof/>
+            <w:webHidden/>
+          </w:rPr>
+          <w:tab/>
+        </w:r>
+        <w:r>
+          <w:rPr>
+            <w:noProof/>
+            <w:webHidden/>
+          </w:rPr>
+          <w:fldChar w:fldCharType="begin"/>
+        </w:r>
+        <w:r>
+          <w:rPr>
+            <w:noProof/>
+            <w:webHidden/>
+          </w:rPr>
+          <w:instrText xml:space="preserve"> PAGEREF _Toc226466874 \h </w:instrText>
+        </w:r>
+        <w:r>
+          <w:rPr>
+            <w:noProof/>
+            <w:webHidden/>
+          </w:rPr>
+        </w:r>
+        <w:r>
+          <w:rPr>
+            <w:noProof/>
+            <w:webHidden/>
+          </w:rPr>
+          <w:fldChar w:fldCharType="separate"/>
+        </w:r>
+        <w:r>
+          <w:rPr>
+            <w:noProof/>
+            <w:webHidden/>
+          </w:rPr>
+          <w:t>5</w:t>
+        </w:r>
+        <w:r>
+          <w:rPr>
+            <w:noProof/>
+            <w:webHidden/>
+          </w:rPr>
+          <w:fldChar w:fldCharType="end"/>
+        </w:r>
+      </w:hyperlink>
+    </w:p>
+    <w:p>
+      <w:pPr>
+        <w:pStyle w:val="TJ2"/>
+        <w:tabs>
+          <w:tab w:val="right" w:leader="dot" w:pos="9062"/>
+        </w:tabs>
+        <w:rPr>
+          <w:rFonts w:eastAsiaTheme="minorEastAsia"/>
+          <w:noProof/>
+          <w:lang w:eastAsia="hu-HU"/>
+        </w:rPr>
+      </w:pPr>
+      <w:hyperlink w:anchor="_Toc226466875" w:history="1">
+        <w:r>
+          <w:rPr>
+            <w:rStyle w:val="Hiperhivatkozs"/>
+            <w:noProof/>
+          </w:rPr>
+          <w:t>Fetch API menü</w:t>
+        </w:r>
+        <w:r>
+          <w:rPr>
+            <w:noProof/>
+            <w:webHidden/>
+          </w:rPr>
+          <w:tab/>
+        </w:r>
+        <w:r>
+          <w:rPr>
+            <w:noProof/>
+            <w:webHidden/>
+          </w:rPr>
+          <w:fldChar w:fldCharType="begin"/>
+        </w:r>
+        <w:r>
+          <w:rPr>
+            <w:noProof/>
+            <w:webHidden/>
+          </w:rPr>
+          <w:instrText xml:space="preserve"> PAGEREF _Toc226466875 \h </w:instrText>
+        </w:r>
+        <w:r>
+          <w:rPr>
+            <w:noProof/>
+            <w:webHidden/>
+          </w:rPr>
+        </w:r>
+        <w:r>
+          <w:rPr>
+            <w:noProof/>
+            <w:webHidden/>
+          </w:rPr>
+          <w:fldChar w:fldCharType="separate"/>
+        </w:r>
+        <w:r>
+          <w:rPr>
+            <w:noProof/>
+            <w:webHidden/>
+          </w:rPr>
+          <w:t>6</w:t>
+        </w:r>
+        <w:r>
+          <w:rPr>
+            <w:noProof/>
+            <w:webHidden/>
+          </w:rPr>
+          <w:fldChar w:fldCharType="end"/>
+        </w:r>
+      </w:hyperlink>
+    </w:p>
+    <w:p>
+      <w:pPr>
+        <w:pStyle w:val="TJ2"/>
+        <w:tabs>
+          <w:tab w:val="right" w:leader="dot" w:pos="9062"/>
+        </w:tabs>
+        <w:rPr>
+          <w:rFonts w:eastAsiaTheme="minorEastAsia"/>
+          <w:noProof/>
+          <w:lang w:eastAsia="hu-HU"/>
+        </w:rPr>
+      </w:pPr>
+      <w:hyperlink w:anchor="_Toc226466876" w:history="1">
+        <w:r>
+          <w:rPr>
+            <w:rStyle w:val="Hiperhivatkozs"/>
+            <w:noProof/>
+          </w:rPr>
+          <w:t>Axios menü</w:t>
+        </w:r>
+        <w:r>
+          <w:rPr>
+            <w:noProof/>
+            <w:webHidden/>
+          </w:rPr>
+          <w:tab/>
+        </w:r>
+        <w:r>
+          <w:rPr>
+            <w:noProof/>
+            <w:webHidden/>
+          </w:rPr>
+          <w:fldChar w:fldCharType="begin"/>
+        </w:r>
+        <w:r>
+          <w:rPr>
+            <w:noProof/>
+            <w:webHidden/>
+          </w:rPr>
+          <w:instrText xml:space="preserve"> PAGEREF _Toc226466876 \h </w:instrText>
+        </w:r>
+        <w:r>
+          <w:rPr>
+            <w:noProof/>
+            <w:webHidden/>
+          </w:rPr>
+        </w:r>
+        <w:r>
+          <w:rPr>
+            <w:noProof/>
+            <w:webHidden/>
+          </w:rPr>
+          <w:fldChar w:fldCharType="separate"/>
+        </w:r>
+        <w:r>
+          <w:rPr>
+            <w:noProof/>
+            <w:webHidden/>
+          </w:rPr>
+          <w:t>7</w:t>
+        </w:r>
+        <w:r>
+          <w:rPr>
+            <w:noProof/>
+            <w:webHidden/>
+          </w:rPr>
+          <w:fldChar w:fldCharType="end"/>
+        </w:r>
+      </w:hyperlink>
+    </w:p>
+    <w:p>
+      <w:pPr>
+        <w:pStyle w:val="TJ2"/>
+        <w:tabs>
+          <w:tab w:val="right" w:leader="dot" w:pos="9062"/>
+        </w:tabs>
+        <w:rPr>
+          <w:rFonts w:eastAsiaTheme="minorEastAsia"/>
+          <w:noProof/>
+          <w:lang w:eastAsia="hu-HU"/>
+        </w:rPr>
+      </w:pPr>
+      <w:hyperlink w:anchor="_Toc226466877" w:history="1">
+        <w:r>
+          <w:rPr>
+            <w:rStyle w:val="Hiperhivatkozs"/>
+            <w:noProof/>
+          </w:rPr>
+          <w:t>OOJS menü</w:t>
+        </w:r>
+        <w:r>
+          <w:rPr>
+            <w:noProof/>
+            <w:webHidden/>
+          </w:rPr>
+          <w:tab/>
+        </w:r>
+        <w:r>
+          <w:rPr>
+            <w:noProof/>
+            <w:webHidden/>
+          </w:rPr>
+          <w:fldChar w:fldCharType="begin"/>
+        </w:r>
+        <w:r>
+          <w:rPr>
+            <w:noProof/>
+            <w:webHidden/>
+          </w:rPr>
+          <w:instrText xml:space="preserve"> PAGEREF _Toc226466877 \h </w:instrText>
+        </w:r>
+        <w:r>
+          <w:rPr>
+            <w:noProof/>
+            <w:webHidden/>
+          </w:rPr>
+        </w:r>
+        <w:r>
+          <w:rPr>
+            <w:noProof/>
+            <w:webHidden/>
+          </w:rPr>
+          <w:fldChar w:fldCharType="separate"/>
+        </w:r>
+        <w:r>
+          <w:rPr>
+            <w:noProof/>
+            <w:webHidden/>
+          </w:rPr>
+          <w:t>8</w:t>
+        </w:r>
+        <w:r>
+          <w:rPr>
+            <w:noProof/>
+            <w:webHidden/>
+          </w:rPr>
+          <w:fldChar w:fldCharType="end"/>
+        </w:r>
+      </w:hyperlink>
+    </w:p>
+    <w:p>
+      <w:pPr>
+        <w:pStyle w:val="TJ1"/>
+        <w:tabs>
+          <w:tab w:val="right" w:leader="dot" w:pos="9062"/>
+        </w:tabs>
+        <w:rPr>
+          <w:rFonts w:eastAsiaTheme="minorEastAsia"/>
+          <w:noProof/>
+          <w:lang w:eastAsia="hu-HU"/>
+        </w:rPr>
+      </w:pPr>
+      <w:hyperlink w:anchor="_Toc226466878" w:history="1">
+        <w:r>
+          <w:rPr>
+            <w:rStyle w:val="Hiperhivatkozs"/>
+            <w:noProof/>
+          </w:rPr>
+          <w:t>Fejlesztői dokumentáció</w:t>
+        </w:r>
+        <w:r>
+          <w:rPr>
+            <w:noProof/>
+            <w:webHidden/>
+          </w:rPr>
+          <w:tab/>
+        </w:r>
+        <w:r>
+          <w:rPr>
+            <w:noProof/>
+            <w:webHidden/>
+          </w:rPr>
+          <w:fldChar w:fldCharType="begin"/>
+        </w:r>
+        <w:r>
+          <w:rPr>
+            <w:noProof/>
+            <w:webHidden/>
+          </w:rPr>
+          <w:instrText xml:space="preserve"> PAGEREF _Toc226466878 \h </w:instrText>
+        </w:r>
+        <w:r>
+          <w:rPr>
+            <w:noProof/>
+            <w:webHidden/>
+          </w:rPr>
+        </w:r>
+        <w:r>
+          <w:rPr>
+            <w:noProof/>
+            <w:webHidden/>
+          </w:rPr>
+          <w:fldChar w:fldCharType="separate"/>
+        </w:r>
+        <w:r>
+          <w:rPr>
+            <w:noProof/>
+            <w:webHidden/>
+          </w:rPr>
+          <w:t>9</w:t>
+        </w:r>
+        <w:r>
+          <w:rPr>
+            <w:noProof/>
+            <w:webHidden/>
+          </w:rPr>
+          <w:fldChar w:fldCharType="end"/>
+        </w:r>
+      </w:hyperlink>
+    </w:p>
+    <w:p>
+      <w:pPr>
+        <w:pStyle w:val="TJ2"/>
+        <w:tabs>
+          <w:tab w:val="right" w:leader="dot" w:pos="9062"/>
+        </w:tabs>
+        <w:rPr>
+          <w:rFonts w:eastAsiaTheme="minorEastAsia"/>
+          <w:noProof/>
+          <w:lang w:eastAsia="hu-HU"/>
+        </w:rPr>
+      </w:pPr>
+      <w:hyperlink w:anchor="_Toc226466879" w:history="1">
+        <w:r>
+          <w:rPr>
+            <w:rStyle w:val="Hiperhivatkozs"/>
+            <w:noProof/>
+          </w:rPr>
+          <w:t>Főoldal</w:t>
+        </w:r>
+        <w:r>
+          <w:rPr>
+            <w:noProof/>
+            <w:webHidden/>
+          </w:rPr>
+          <w:tab/>
+        </w:r>
+        <w:r>
+          <w:rPr>
+            <w:noProof/>
+            <w:webHidden/>
+          </w:rPr>
+          <w:fldChar w:fldCharType="begin"/>
+        </w:r>
+        <w:r>
+          <w:rPr>
+            <w:noProof/>
+            <w:webHidden/>
+          </w:rPr>
+          <w:instrText xml:space="preserve"> PAGEREF _Toc226466879 \h </w:instrText>
+        </w:r>
+        <w:r>
+          <w:rPr>
+            <w:noProof/>
+            <w:webHidden/>
+          </w:rPr>
+        </w:r>
+        <w:r>
+          <w:rPr>
+            <w:noProof/>
+            <w:webHidden/>
+          </w:rPr>
+          <w:fldChar w:fldCharType="separate"/>
+        </w:r>
+        <w:r>
+          <w:rPr>
+            <w:noProof/>
+            <w:webHidden/>
+          </w:rPr>
+          <w:t>9</w:t>
+        </w:r>
+        <w:r>
+          <w:rPr>
+            <w:noProof/>
+            <w:webHidden/>
+          </w:rPr>
+          <w:fldChar w:fldCharType="end"/>
+        </w:r>
+      </w:hyperlink>
+    </w:p>
+    <w:p>
+      <w:pPr>
+        <w:pStyle w:val="TJ2"/>
+        <w:tabs>
+          <w:tab w:val="right" w:leader="dot" w:pos="9062"/>
+        </w:tabs>
+        <w:rPr>
+          <w:rFonts w:eastAsiaTheme="minorEastAsia"/>
+          <w:noProof/>
+          <w:lang w:eastAsia="hu-HU"/>
+        </w:rPr>
+      </w:pPr>
+      <w:hyperlink w:anchor="_Toc226466880" w:history="1">
+        <w:r>
+          <w:rPr>
+            <w:rStyle w:val="Hiperhivatkozs"/>
+            <w:noProof/>
+          </w:rPr>
+          <w:t>JavaScript menü</w:t>
+        </w:r>
+        <w:r>
+          <w:rPr>
+            <w:noProof/>
+            <w:webHidden/>
+          </w:rPr>
+          <w:tab/>
+        </w:r>
+        <w:r>
+          <w:rPr>
+            <w:noProof/>
+            <w:webHidden/>
+          </w:rPr>
+          <w:fldChar w:fldCharType="begin"/>
+        </w:r>
+        <w:r>
+          <w:rPr>
+            <w:noProof/>
+            <w:webHidden/>
+          </w:rPr>
+          <w:instrText xml:space="preserve"> PAGEREF _Toc226466880 \h </w:instrText>
+        </w:r>
+        <w:r>
+          <w:rPr>
+            <w:noProof/>
+            <w:webHidden/>
+          </w:rPr>
+        </w:r>
+        <w:r>
+          <w:rPr>
+            <w:noProof/>
+            <w:webHidden/>
+          </w:rPr>
+          <w:fldChar w:fldCharType="separate"/>
+        </w:r>
+        <w:r>
+          <w:rPr>
+            <w:noProof/>
+            <w:webHidden/>
+          </w:rPr>
+          <w:t>9</w:t>
+        </w:r>
+        <w:r>
+          <w:rPr>
+            <w:noProof/>
+            <w:webHidden/>
+          </w:rPr>
+          <w:fldChar w:fldCharType="end"/>
+        </w:r>
+      </w:hyperlink>
+    </w:p>
+    <w:p>
+      <w:pPr>
+        <w:pStyle w:val="TJ2"/>
+        <w:tabs>
+          <w:tab w:val="right" w:leader="dot" w:pos="9062"/>
+        </w:tabs>
+        <w:rPr>
+          <w:rFonts w:eastAsiaTheme="minorEastAsia"/>
+          <w:noProof/>
+          <w:lang w:eastAsia="hu-HU"/>
+        </w:rPr>
+      </w:pPr>
+      <w:hyperlink w:anchor="_Toc226466881" w:history="1">
+        <w:r>
+          <w:rPr>
+            <w:rStyle w:val="Hiperhivatkozs"/>
+            <w:noProof/>
+          </w:rPr>
+          <w:t>React menü</w:t>
+        </w:r>
+        <w:r>
+          <w:rPr>
+            <w:noProof/>
+            <w:webHidden/>
+          </w:rPr>
+          <w:tab/>
+        </w:r>
+        <w:r>
+          <w:rPr>
+            <w:noProof/>
+            <w:webHidden/>
+          </w:rPr>
+          <w:fldChar w:fldCharType="begin"/>
+        </w:r>
+        <w:r>
+          <w:rPr>
+            <w:noProof/>
+            <w:webHidden/>
+          </w:rPr>
+          <w:instrText xml:space="preserve"> PAGEREF _Toc226466881 \h </w:instrText>
+        </w:r>
+        <w:r>
+          <w:rPr>
+            <w:noProof/>
+            <w:webHidden/>
+          </w:rPr>
+        </w:r>
+        <w:r>
+          <w:rPr>
+            <w:noProof/>
+            <w:webHidden/>
+          </w:rPr>
+          <w:fldChar w:fldCharType="separate"/>
+        </w:r>
+        <w:r>
+          <w:rPr>
+            <w:noProof/>
+            <w:webHidden/>
+          </w:rPr>
+          <w:t>9</w:t>
+        </w:r>
+        <w:r>
+          <w:rPr>
+            <w:noProof/>
+            <w:webHidden/>
+          </w:rPr>
+          <w:fldChar w:fldCharType="end"/>
+        </w:r>
+      </w:hyperlink>
+    </w:p>
+    <w:p>
+      <w:pPr>
+        <w:pStyle w:val="TJ2"/>
+        <w:tabs>
+          <w:tab w:val="right" w:leader="dot" w:pos="9062"/>
+        </w:tabs>
+        <w:rPr>
+          <w:rFonts w:eastAsiaTheme="minorEastAsia"/>
+          <w:noProof/>
+          <w:lang w:eastAsia="hu-HU"/>
+        </w:rPr>
+      </w:pPr>
+      <w:hyperlink w:anchor="_Toc226466882" w:history="1">
+        <w:r>
+          <w:rPr>
+            <w:rStyle w:val="Hiperhivatkozs"/>
+            <w:noProof/>
+          </w:rPr>
+          <w:t>SPA menü</w:t>
+        </w:r>
+        <w:r>
+          <w:rPr>
+            <w:noProof/>
+            <w:webHidden/>
+          </w:rPr>
+          <w:tab/>
+        </w:r>
+        <w:r>
+          <w:rPr>
+            <w:noProof/>
+            <w:webHidden/>
+          </w:rPr>
+          <w:fldChar w:fldCharType="begin"/>
+        </w:r>
+        <w:r>
+          <w:rPr>
+            <w:noProof/>
+            <w:webHidden/>
+          </w:rPr>
+          <w:instrText xml:space="preserve"> PAGEREF _Toc226466882 \h </w:instrText>
+        </w:r>
+        <w:r>
+          <w:rPr>
+            <w:noProof/>
+            <w:webHidden/>
+          </w:rPr>
+        </w:r>
+        <w:r>
+          <w:rPr>
+            <w:noProof/>
+            <w:webHidden/>
+          </w:rPr>
+          <w:fldChar w:fldCharType="separate"/>
+        </w:r>
+        <w:r>
+          <w:rPr>
+            <w:noProof/>
+            <w:webHidden/>
+          </w:rPr>
+          <w:t>9</w:t>
+        </w:r>
+        <w:r>
+          <w:rPr>
+            <w:noProof/>
+            <w:webHidden/>
+          </w:rPr>
+          <w:fldChar w:fldCharType="end"/>
+        </w:r>
+      </w:hyperlink>
+    </w:p>
+    <w:p>
+      <w:pPr>
+        <w:pStyle w:val="TJ2"/>
+        <w:tabs>
+          <w:tab w:val="right" w:leader="dot" w:pos="9062"/>
+        </w:tabs>
+        <w:rPr>
+          <w:rFonts w:eastAsiaTheme="minorEastAsia"/>
+          <w:noProof/>
+          <w:lang w:eastAsia="hu-HU"/>
+        </w:rPr>
+      </w:pPr>
+      <w:hyperlink w:anchor="_Toc226466883" w:history="1">
+        <w:r>
+          <w:rPr>
+            <w:rStyle w:val="Hiperhivatkozs"/>
+            <w:noProof/>
+          </w:rPr>
+          <w:t>Fetch API menü</w:t>
+        </w:r>
+        <w:r>
+          <w:rPr>
+            <w:noProof/>
+            <w:webHidden/>
+          </w:rPr>
+          <w:tab/>
+        </w:r>
+        <w:r>
+          <w:rPr>
+            <w:noProof/>
+            <w:webHidden/>
+          </w:rPr>
+          <w:fldChar w:fldCharType="begin"/>
+        </w:r>
+        <w:r>
+          <w:rPr>
+            <w:noProof/>
+            <w:webHidden/>
+          </w:rPr>
+          <w:instrText xml:space="preserve"> PAGEREF _Toc226466883 \h </w:instrText>
+        </w:r>
+        <w:r>
+          <w:rPr>
+            <w:noProof/>
+            <w:webHidden/>
+          </w:rPr>
+        </w:r>
+        <w:r>
+          <w:rPr>
+            <w:noProof/>
+            <w:webHidden/>
+          </w:rPr>
+          <w:fldChar w:fldCharType="separate"/>
+        </w:r>
+        <w:r>
+          <w:rPr>
+            <w:noProof/>
+            <w:webHidden/>
+          </w:rPr>
+          <w:t>9</w:t>
+        </w:r>
+        <w:r>
+          <w:rPr>
+            <w:noProof/>
+            <w:webHidden/>
+          </w:rPr>
+          <w:fldChar w:fldCharType="end"/>
+        </w:r>
+      </w:hyperlink>
+    </w:p>
+    <w:p>
+      <w:pPr>
+        <w:pStyle w:val="TJ2"/>
+        <w:tabs>
+          <w:tab w:val="right" w:leader="dot" w:pos="9062"/>
+        </w:tabs>
+        <w:rPr>
+          <w:rFonts w:eastAsiaTheme="minorEastAsia"/>
+          <w:noProof/>
+          <w:lang w:eastAsia="hu-HU"/>
+        </w:rPr>
+      </w:pPr>
+      <w:hyperlink w:anchor="_Toc226466884" w:history="1">
+        <w:r>
+          <w:rPr>
+            <w:rStyle w:val="Hiperhivatkozs"/>
+            <w:noProof/>
+          </w:rPr>
+          <w:t>Axios menü</w:t>
+        </w:r>
+        <w:r>
+          <w:rPr>
+            <w:noProof/>
+            <w:webHidden/>
+          </w:rPr>
+          <w:tab/>
+        </w:r>
+        <w:r>
+          <w:rPr>
+            <w:noProof/>
+            <w:webHidden/>
+          </w:rPr>
+          <w:fldChar w:fldCharType="begin"/>
+        </w:r>
+        <w:r>
+          <w:rPr>
+            <w:noProof/>
+            <w:webHidden/>
+          </w:rPr>
+          <w:instrText xml:space="preserve"> PAGEREF _Toc226466884 \h </w:instrText>
+        </w:r>
+        <w:r>
+          <w:rPr>
+            <w:noProof/>
+            <w:webHidden/>
+          </w:rPr>
+        </w:r>
+        <w:r>
+          <w:rPr>
+            <w:noProof/>
+            <w:webHidden/>
+          </w:rPr>
+          <w:fldChar w:fldCharType="separate"/>
+        </w:r>
+        <w:r>
+          <w:rPr>
+            <w:noProof/>
+            <w:webHidden/>
+          </w:rPr>
+          <w:t>9</w:t>
+        </w:r>
+        <w:r>
+          <w:rPr>
+            <w:noProof/>
+            <w:webHidden/>
+          </w:rPr>
+          <w:fldChar w:fldCharType="end"/>
+        </w:r>
+      </w:hyperlink>
+    </w:p>
+    <w:p>
+      <w:pPr>
+        <w:pStyle w:val="TJ2"/>
+        <w:tabs>
+          <w:tab w:val="right" w:leader="dot" w:pos="9062"/>
+        </w:tabs>
+        <w:rPr>
+          <w:rFonts w:eastAsiaTheme="minorEastAsia"/>
+          <w:noProof/>
+          <w:lang w:eastAsia="hu-HU"/>
+        </w:rPr>
+      </w:pPr>
+      <w:hyperlink w:anchor="_Toc226466885" w:history="1">
+        <w:r>
+          <w:rPr>
+            <w:rStyle w:val="Hiperhivatkozs"/>
+            <w:noProof/>
+          </w:rPr>
+          <w:t>OOJS menü</w:t>
+        </w:r>
+        <w:r>
+          <w:rPr>
+            <w:noProof/>
+            <w:webHidden/>
+          </w:rPr>
+          <w:tab/>
+        </w:r>
+        <w:r>
+          <w:rPr>
+            <w:noProof/>
+            <w:webHidden/>
+          </w:rPr>
+          <w:fldChar w:fldCharType="begin"/>
+        </w:r>
+        <w:r>
+          <w:rPr>
+            <w:noProof/>
+            <w:webHidden/>
+          </w:rPr>
+          <w:instrText xml:space="preserve"> PAGEREF _Toc226466885 \h </w:instrText>
+        </w:r>
+        <w:r>
+          <w:rPr>
+            <w:noProof/>
+            <w:webHidden/>
+          </w:rPr>
+        </w:r>
+        <w:r>
+          <w:rPr>
+            <w:noProof/>
+            <w:webHidden/>
+          </w:rPr>
+          <w:fldChar w:fldCharType="separate"/>
+        </w:r>
+        <w:r>
+          <w:rPr>
+            <w:noProof/>
+            <w:webHidden/>
+          </w:rPr>
+          <w:t>9</w:t>
+        </w:r>
+        <w:r>
+          <w:rPr>
+            <w:noProof/>
+            <w:webHidden/>
+          </w:rPr>
+          <w:fldChar w:fldCharType="end"/>
+        </w:r>
+      </w:hyperlink>
+    </w:p>
+    <w:p>
+      <w:r>
+        <w:fldChar w:fldCharType="end"/>
+      </w:r>
+      <w:r>
+        <w:br w:type="page"/>
+      </w:r>
+    </w:p>
+    <w:p>
+      <w:pPr>
+        <w:pStyle w:val="Cmsor1"/>
+      </w:pPr>
+      <w:bookmarkStart w:id="0" w:name="_Felhasználói_dokumentáció"/>
+      <w:bookmarkStart w:id="1" w:name="_Toc226466870"/>
+      <w:bookmarkEnd w:id="0"/>
+      <w:r>
+        <w:lastRenderedPageBreak/>
+        <w:t>Felhasználói dokumentáció</w:t>
+      </w:r>
+      <w:bookmarkEnd w:id="1"/>
+    </w:p>
+    <w:p>
+      <w:pPr>
+        <w:pStyle w:val="Cmsor2"/>
+      </w:pPr>
+      <w:bookmarkStart w:id="2" w:name="_Toc226466871"/>
+      <w:r>
+        <w:t>Főoldal</w:t>
+      </w:r>
+      <w:bookmarkEnd w:id="2"/>
+    </w:p>
+    <w:p>
+      <w:r>
+        <w:t xml:space="preserve">Oldal URL: </w:t>
+      </w:r>
+      <w:hyperlink r:id="rId6" w:history="1">
+        <w:r>
+          <w:rPr>
+            <w:rStyle w:val="Hiperhivatkozs"/>
+          </w:rPr>
+          <w:t>https://webprog1mged.page.gd</w:t>
+        </w:r>
+      </w:hyperlink>
+    </w:p>
+    <w:p>
+      <w:r>
+        <w:t>Az oldal fő része, ahonnan elérhető az összes későbbiekben bemutatott aloldal.</w:t>
+      </w:r>
+    </w:p>
+    <w:p>
+      <w:r>
+        <w:br w:type="page"/>
+      </w:r>
+    </w:p>
+    <w:p>
+      <w:pPr>
+        <w:pStyle w:val="Cmsor2"/>
+      </w:pPr>
+      <w:bookmarkStart w:id="3" w:name="_Toc226466872"/>
+      <w:r>
+        <w:lastRenderedPageBreak/>
+        <w:t>JavaScript menü</w:t>
+      </w:r>
+      <w:bookmarkEnd w:id="3"/>
+    </w:p>
+    <w:p>
+      <w:r>
+        <w:t xml:space="preserve">Oldal URL: </w:t>
+      </w:r>
+      <w:hyperlink r:id="rId7" w:history="1">
+        <w:r>
+          <w:rPr>
+            <w:rStyle w:val="Hiperhivatkozs"/>
+          </w:rPr>
+          <w:t>https://webprog1mged.page.gd/j</w:t>
+        </w:r>
+        <w:r>
+          <w:rPr>
+            <w:rStyle w:val="Hiperhivatkozs"/>
+          </w:rPr>
+          <w:t>a</w:t>
+        </w:r>
+        <w:r>
+          <w:rPr>
+            <w:rStyle w:val="Hiperhivatkozs"/>
+          </w:rPr>
+          <w:t>vascript_crud/javascript.html</w:t>
+        </w:r>
+      </w:hyperlink>
+    </w:p>
+    <w:p>
+      <w:r>
+        <w:drawing>
+          <wp:inline distT="0" distB="0" distL="0" distR="0" wp14:anchorId="3C5B325F" wp14:editId="07DCF1F5">
+            <wp:extent cx="5760720" cy="1967948"/>
+            <wp:effectExtent l="0" t="0" r="0" b="0"/>
+            <wp:docPr id="1181109710" name="Kép 1"/>
+            <wp:cNvGraphicFramePr>
+              <a:graphicFrameLocks xmlns:a="http://schemas.openxmlformats.org/drawingml/2006/main" noChangeAspect="1"/>
+            </wp:cNvGraphicFramePr>
+            <a:graphic xmlns:a="http://schemas.openxmlformats.org/drawingml/2006/main">
+              <a:graphicData uri="http://schemas.openxmlformats.org/drawingml/2006/picture">
+                <pic:pic xmlns:pic="http://schemas.openxmlformats.org/drawingml/2006/picture">
+                  <pic:nvPicPr>
+                    <pic:cNvPr id="1181109710" name=""/>
+                    <pic:cNvPicPr/>
+                  </pic:nvPicPr>
+                  <pic:blipFill rotWithShape="1">
+                    <a:blip r:embed="rId8"/>
+                    <a:srcRect t="6427"/>
+                    <a:stretch>
+                      <a:fillRect/>
+                    </a:stretch>
+                  </pic:blipFill>
+                  <pic:spPr bwMode="auto">
+                    <a:xfrm>
+                      <a:off x="0" y="0"/>
+                      <a:ext cx="5760720" cy="1967948"/>
+                    </a:xfrm>
+                    <a:prstGeom prst="rect">
+                      <a:avLst/>
+                    </a:prstGeom>
+                    <a:ln>
+                      <a:noFill/>
+                    </a:ln>
+                    <a:extLst>
+                      <a:ext uri="{53640926-AAD7-44D8-BBD7-CCE9431645EC}">
+                        <a14:shadowObscured xmlns:a14="http://schemas.microsoft.com/office/drawing/2010/main"/>
+                      </a:ext>
+                    </a:extLst>
+                  </pic:spPr>
+                </pic:pic>
+              </a:graphicData>
+            </a:graphic>
+          </wp:inline>
+        </w:drawing>
+      </w:r>
+    </w:p>
+    <w:p>
+      <w:r>
+        <w:t>Az oldal táblázatos formában megjeleníti a gépek adatait, amelyeken az alábbi műveletek végezhetőek:</w:t>
+      </w:r>
+    </w:p>
+    <w:p>
+      <w:pPr>
+        <w:pStyle w:val="Listaszerbekezds"/>
+        <w:numPr>
+          <w:ilvl w:val="0"/>
+          <w:numId w:val="1"/>
+        </w:numPr>
+        <w:rPr>
+          <w:b/>
+          <w:bCs/>
+        </w:rPr>
+      </w:pPr>
+      <w:r>
+        <w:rPr>
+          <w:b/>
+          <w:bCs/>
+        </w:rPr>
+        <w:t>Új adat felvétele</w:t>
+      </w:r>
+    </w:p>
+    <w:p>
+      <w:pPr>
+        <w:pStyle w:val="Listaszerbekezds"/>
+        <w:ind w:left="360"/>
+      </w:pPr>
+      <w:r>
+        <w:t xml:space="preserve">A táblázat fejléce és az első adat között található </w:t>
+      </w:r>
+      <w:r>
+        <w:t xml:space="preserve"> </w:t>
+      </w:r>
+      <w:r>
+        <w:t>„+ Új adat felvétele” gombra kattintva érhetjük el ezt a funkciót</w:t>
+      </w:r>
+      <w:r>
+        <w:t xml:space="preserve"> egy felugró ablakban</w:t>
+      </w:r>
+      <w:r>
+        <w:t>.</w:t>
+      </w:r>
+      <w:r>
+        <w:rPr>
+          <w:noProof/>
+        </w:rPr>
+        <w:t xml:space="preserve"> </w:t>
+      </w:r>
+      <w:r>
+        <w:drawing>
+          <wp:inline distT="0" distB="0" distL="0" distR="0" wp14:anchorId="7175BACC" wp14:editId="4C8C1EB1">
+            <wp:extent cx="3620005" cy="257211"/>
+            <wp:effectExtent l="0" t="0" r="0" b="9525"/>
+            <wp:docPr id="726136002" name="Kép 1"/>
+            <wp:cNvGraphicFramePr>
+              <a:graphicFrameLocks xmlns:a="http://schemas.openxmlformats.org/drawingml/2006/main" noChangeAspect="1"/>
+            </wp:cNvGraphicFramePr>
+            <a:graphic xmlns:a="http://schemas.openxmlformats.org/drawingml/2006/main">
+              <a:graphicData uri="http://schemas.openxmlformats.org/drawingml/2006/picture">
+                <pic:pic xmlns:pic="http://schemas.openxmlformats.org/drawingml/2006/picture">
+                  <pic:nvPicPr>
+                    <pic:cNvPr id="726136002" name=""/>
+                    <pic:cNvPicPr/>
+                  </pic:nvPicPr>
+                  <pic:blipFill>
+                    <a:blip r:embed="rId9"/>
+                    <a:stretch>
+                      <a:fillRect/>
+                    </a:stretch>
+                  </pic:blipFill>
+                  <pic:spPr>
+                    <a:xfrm>
+                      <a:off x="0" y="0"/>
+                      <a:ext cx="3620005" cy="257211"/>
+                    </a:xfrm>
+                    <a:prstGeom prst="rect">
+                      <a:avLst/>
+                    </a:prstGeom>
+                  </pic:spPr>
+                </pic:pic>
+              </a:graphicData>
+            </a:graphic>
+          </wp:inline>
+        </w:drawing>
+      </w:r>
+    </w:p>
+    <w:p>
+      <w:pPr>
+        <w:pStyle w:val="Listaszerbekezds"/>
+        <w:ind w:left="360"/>
+      </w:pPr>
+      <w:r>
+        <w:t>Egy új adatnak kötelezően meg kell adni az ID-t, helyet, típust és IP-címet.</w:t>
+      </w:r>
+    </w:p>
+    <w:p>
+      <w:pPr>
+        <w:pStyle w:val="Listaszerbekezds"/>
+        <w:ind w:left="360"/>
+      </w:pPr>
+      <w:r>
+        <w:t xml:space="preserve">Az ID-nek egyedi értéknek és számnak kell lennie, valamint az IP-címnél is figyelni kell a megfelelő formátumra. </w:t>
+      </w:r>
+      <w:r>
+        <w:t>Amennyiben mégsem szeretnénk hozzáadni, kattintsunk a „Mégse” gombra, vagy egyszerűen csak az elsötétített területre.</w:t>
+      </w:r>
+    </w:p>
+    <w:p>
+      <w:pPr>
+        <w:pStyle w:val="Listaszerbekezds"/>
+        <w:ind w:left="360"/>
+      </w:pPr>
+      <w:r>
+        <w:drawing>
+          <wp:inline distT="0" distB="0" distL="0" distR="0" wp14:anchorId="4EE9BE0C" wp14:editId="2DA7DB03">
+            <wp:extent cx="4680000" cy="954881"/>
+            <wp:effectExtent l="0" t="0" r="6350" b="0"/>
+            <wp:docPr id="400051376" name="Kép 1"/>
+            <wp:cNvGraphicFramePr>
+              <a:graphicFrameLocks xmlns:a="http://schemas.openxmlformats.org/drawingml/2006/main" noChangeAspect="1"/>
+            </wp:cNvGraphicFramePr>
+            <a:graphic xmlns:a="http://schemas.openxmlformats.org/drawingml/2006/main">
+              <a:graphicData uri="http://schemas.openxmlformats.org/drawingml/2006/picture">
+                <pic:pic xmlns:pic="http://schemas.openxmlformats.org/drawingml/2006/picture">
+                  <pic:nvPicPr>
+                    <pic:cNvPr id="400051376" name=""/>
+                    <pic:cNvPicPr/>
+                  </pic:nvPicPr>
+                  <pic:blipFill>
+                    <a:blip r:embed="rId10"/>
+                    <a:stretch>
+                      <a:fillRect/>
+                    </a:stretch>
+                  </pic:blipFill>
+                  <pic:spPr>
+                    <a:xfrm>
+                      <a:off x="0" y="0"/>
+                      <a:ext cx="4680000" cy="954881"/>
+                    </a:xfrm>
+                    <a:prstGeom prst="rect">
+                      <a:avLst/>
+                    </a:prstGeom>
+                  </pic:spPr>
+                </pic:pic>
+              </a:graphicData>
+            </a:graphic>
+          </wp:inline>
+        </w:drawing>
+      </w:r>
+    </w:p>
+    <w:p>
+      <w:pPr>
+        <w:pStyle w:val="Listaszerbekezds"/>
+        <w:numPr>
+          <w:ilvl w:val="0"/>
+          <w:numId w:val="1"/>
+        </w:numPr>
+        <w:rPr>
+          <w:b/>
+          <w:bCs/>
+        </w:rPr>
+      </w:pPr>
+      <w:r>
+        <w:rPr>
+          <w:b/>
+          <w:bCs/>
+        </w:rPr>
+        <w:t>Meglévő adatok módosítása</w:t>
+      </w:r>
+    </w:p>
+    <w:p>
+      <w:pPr>
+        <w:pStyle w:val="Listaszerbekezds"/>
+        <w:ind w:left="360"/>
+        <w:rPr>
+          <w:noProof/>
+        </w:rPr>
+      </w:pPr>
+      <w:r>
+        <w:drawing>
+          <wp:anchor distT="0" distB="0" distL="114300" distR="114300" simplePos="0" relativeHeight="251658240" behindDoc="0" locked="0" layoutInCell="1" allowOverlap="1" wp14:anchorId="2906C2D8" wp14:editId="71DCDC88">
+            <wp:simplePos x="0" y="0"/>
+            <wp:positionH relativeFrom="column">
+              <wp:posOffset>5198303</wp:posOffset>
+            </wp:positionH>
+            <wp:positionV relativeFrom="paragraph">
+              <wp:posOffset>11071</wp:posOffset>
+            </wp:positionV>
+            <wp:extent cx="809625" cy="228600"/>
+            <wp:effectExtent l="0" t="0" r="9525" b="0"/>
+            <wp:wrapSquare wrapText="bothSides"/>
+            <wp:docPr id="1001103049" name="Kép 1"/>
+            <wp:cNvGraphicFramePr>
+              <a:graphicFrameLocks xmlns:a="http://schemas.openxmlformats.org/drawingml/2006/main" noChangeAspect="1"/>
+            </wp:cNvGraphicFramePr>
+            <a:graphic xmlns:a="http://schemas.openxmlformats.org/drawingml/2006/main">
+              <a:graphicData uri="http://schemas.openxmlformats.org/drawingml/2006/picture">
+                <pic:pic xmlns:pic="http://schemas.openxmlformats.org/drawingml/2006/picture">
+                  <pic:nvPicPr>
+                    <pic:cNvPr id="1001103049" name=""/>
+                    <pic:cNvPicPr/>
+                  </pic:nvPicPr>
+                  <pic:blipFill>
+                    <a:blip r:embed="rId11">
+                      <a:extLst>
+                        <a:ext uri="{28A0092B-C50C-407E-A947-70E740481C1C}">
+                          <a14:useLocalDpi xmlns:a14="http://schemas.microsoft.com/office/drawing/2010/main" val="0"/>
+                        </a:ext>
+                      </a:extLst>
+                    </a:blip>
+                    <a:stretch>
+                      <a:fillRect/>
+                    </a:stretch>
+                  </pic:blipFill>
+                  <pic:spPr>
+                    <a:xfrm>
+                      <a:off x="0" y="0"/>
+                      <a:ext cx="809625" cy="228600"/>
+                    </a:xfrm>
+                    <a:prstGeom prst="rect">
+                      <a:avLst/>
+                    </a:prstGeom>
+                  </pic:spPr>
+                </pic:pic>
+              </a:graphicData>
+            </a:graphic>
+          </wp:anchor>
+        </w:drawing>
+      </w:r>
+      <w:r>
+        <w:t xml:space="preserve">Minden adatsorban megtalálható a </w:t>
+      </w:r>
+      <w:r>
+        <w:t>„Módosítás”</w:t>
+      </w:r>
+      <w:r>
+        <w:t xml:space="preserve"> gomb, </w:t>
+      </w:r>
+      <w:r>
+        <w:t xml:space="preserve">amely lehetővé teszi az adatok megváltoztatását. </w:t>
+      </w:r>
+      <w:r>
+        <w:rPr>
+          <w:noProof/>
+        </w:rPr>
+        <w:t>Az adatfelvételhez hasonlóan ugyanazok a szabályok vonatkoznak erre a részre is.</w:t>
+      </w:r>
+      <w:r>
+        <w:rPr>
+          <w:noProof/>
+        </w:rPr>
+        <w:t xml:space="preserve"> Bezárni szintén úgy lehet, mint hozzáadásnál.</w:t>
+      </w:r>
+    </w:p>
+    <w:p>
+      <w:pPr>
+        <w:pStyle w:val="Listaszerbekezds"/>
+        <w:ind w:left="360"/>
+      </w:pPr>
+      <w:r>
+        <w:drawing>
+          <wp:inline distT="0" distB="0" distL="0" distR="0" wp14:anchorId="458186C1" wp14:editId="594DE74F">
+            <wp:extent cx="4680000" cy="949722"/>
+            <wp:effectExtent l="0" t="0" r="6350" b="3175"/>
+            <wp:docPr id="613624837" name="Kép 1"/>
+            <wp:cNvGraphicFramePr>
+              <a:graphicFrameLocks xmlns:a="http://schemas.openxmlformats.org/drawingml/2006/main" noChangeAspect="1"/>
+            </wp:cNvGraphicFramePr>
+            <a:graphic xmlns:a="http://schemas.openxmlformats.org/drawingml/2006/main">
+              <a:graphicData uri="http://schemas.openxmlformats.org/drawingml/2006/picture">
+                <pic:pic xmlns:pic="http://schemas.openxmlformats.org/drawingml/2006/picture">
+                  <pic:nvPicPr>
+                    <pic:cNvPr id="613624837" name=""/>
+                    <pic:cNvPicPr/>
+                  </pic:nvPicPr>
+                  <pic:blipFill>
+                    <a:blip r:embed="rId12"/>
+                    <a:stretch>
+                      <a:fillRect/>
+                    </a:stretch>
+                  </pic:blipFill>
+                  <pic:spPr>
+                    <a:xfrm>
+                      <a:off x="0" y="0"/>
+                      <a:ext cx="4680000" cy="949722"/>
+                    </a:xfrm>
+                    <a:prstGeom prst="rect">
+                      <a:avLst/>
+                    </a:prstGeom>
+                  </pic:spPr>
+                </pic:pic>
+              </a:graphicData>
+            </a:graphic>
+          </wp:inline>
+        </w:drawing>
+      </w:r>
+    </w:p>
+    <w:p>
+      <w:pPr>
+        <w:pStyle w:val="Listaszerbekezds"/>
+        <w:numPr>
+          <w:ilvl w:val="0"/>
+          <w:numId w:val="1"/>
+        </w:numPr>
+        <w:rPr>
+          <w:b/>
+          <w:bCs/>
+        </w:rPr>
+      </w:pPr>
+      <w:r>
+        <w:rPr>
+          <w:b/>
+          <w:bCs/>
+        </w:rPr>
+        <w:t>Adatok törlése</w:t>
+      </w:r>
+    </w:p>
+    <w:p>
+      <w:pPr>
+        <w:pStyle w:val="Listaszerbekezds"/>
+        <w:ind w:left="360"/>
+      </w:pPr>
+      <w:r>
+        <w:drawing>
+          <wp:anchor distT="0" distB="0" distL="114300" distR="114300" simplePos="0" relativeHeight="251659264" behindDoc="0" locked="0" layoutInCell="1" allowOverlap="1" wp14:anchorId="6F1B677A" wp14:editId="7834EEAF">
+            <wp:simplePos x="0" y="0"/>
+            <wp:positionH relativeFrom="column">
+              <wp:posOffset>5452690</wp:posOffset>
+            </wp:positionH>
+            <wp:positionV relativeFrom="paragraph">
+              <wp:posOffset>10133</wp:posOffset>
+            </wp:positionV>
+            <wp:extent cx="571500" cy="228600"/>
+            <wp:effectExtent l="0" t="0" r="0" b="0"/>
+            <wp:wrapSquare wrapText="bothSides"/>
+            <wp:docPr id="200022481" name="Kép 1"/>
+            <wp:cNvGraphicFramePr>
+              <a:graphicFrameLocks xmlns:a="http://schemas.openxmlformats.org/drawingml/2006/main" noChangeAspect="1"/>
+            </wp:cNvGraphicFramePr>
+            <a:graphic xmlns:a="http://schemas.openxmlformats.org/drawingml/2006/main">
+              <a:graphicData uri="http://schemas.openxmlformats.org/drawingml/2006/picture">
+                <pic:pic xmlns:pic="http://schemas.openxmlformats.org/drawingml/2006/picture">
+                  <pic:nvPicPr>
+                    <pic:cNvPr id="200022481" name=""/>
+                    <pic:cNvPicPr/>
+                  </pic:nvPicPr>
+                  <pic:blipFill>
+                    <a:blip r:embed="rId13">
+                      <a:extLst>
+                        <a:ext uri="{28A0092B-C50C-407E-A947-70E740481C1C}">
+                          <a14:useLocalDpi xmlns:a14="http://schemas.microsoft.com/office/drawing/2010/main" val="0"/>
+                        </a:ext>
+                      </a:extLst>
+                    </a:blip>
+                    <a:stretch>
+                      <a:fillRect/>
+                    </a:stretch>
+                  </pic:blipFill>
+                  <pic:spPr>
+                    <a:xfrm>
+                      <a:off x="0" y="0"/>
+                      <a:ext cx="571500" cy="228600"/>
+                    </a:xfrm>
+                    <a:prstGeom prst="rect">
+                      <a:avLst/>
+                    </a:prstGeom>
+                  </pic:spPr>
+                </pic:pic>
+              </a:graphicData>
+            </a:graphic>
+          </wp:anchor>
+        </w:drawing>
+      </w:r>
+      <w:r>
+        <w:t>Az adatsorokban megtalálható a „Törlés” gomb is, amelyre kattintva a törlés azonnal megtörténik.</w:t>
+      </w:r>
+      <w:r>
+        <w:rPr>
+          <w:noProof/>
+        </w:rPr>
+        <w:t xml:space="preserve"> </w:t>
+      </w:r>
+      <w:r>
+        <w:br w:type="page"/>
+      </w:r>
+    </w:p>
+    <w:p>
+      <w:pPr>
+        <w:pStyle w:val="Cmsor2"/>
+      </w:pPr>
+      <w:bookmarkStart w:id="4" w:name="_Toc226466873"/>
+      <w:r>
+        <w:lastRenderedPageBreak/>
+        <w:t>React menü</w:t>
+      </w:r>
+      <w:bookmarkEnd w:id="4"/>
+    </w:p>
+    <w:p>
+      <w:r>
+        <w:t xml:space="preserve">Oldal URL: </w:t>
+      </w:r>
+      <w:hyperlink r:id="rId14" w:history="1">
+        <w:r>
+          <w:rPr>
+            <w:rStyle w:val="Hiperhivatkozs"/>
+          </w:rPr>
+          <w:t>https://webprog1mged.page.gd/react</w:t>
+        </w:r>
+        <w:r>
+          <w:rPr>
+            <w:rStyle w:val="Hiperhivatkozs"/>
+          </w:rPr>
+          <w:t>_</w:t>
+        </w:r>
+        <w:r>
+          <w:rPr>
+            <w:rStyle w:val="Hiperhivatkozs"/>
+          </w:rPr>
+          <w:t>crud/react.html</w:t>
+        </w:r>
+      </w:hyperlink>
+    </w:p>
+    <w:p>
+      <w:r>
+        <w:drawing>
+          <wp:inline distT="0" distB="0" distL="0" distR="0" wp14:anchorId="09201F83" wp14:editId="082E87E9">
+            <wp:extent cx="5760720" cy="2122170"/>
+            <wp:effectExtent l="0" t="0" r="0" b="0"/>
+            <wp:docPr id="312433678" name="Kép 1"/>
+            <wp:cNvGraphicFramePr>
+              <a:graphicFrameLocks xmlns:a="http://schemas.openxmlformats.org/drawingml/2006/main" noChangeAspect="1"/>
+            </wp:cNvGraphicFramePr>
+            <a:graphic xmlns:a="http://schemas.openxmlformats.org/drawingml/2006/main">
+              <a:graphicData uri="http://schemas.openxmlformats.org/drawingml/2006/picture">
+                <pic:pic xmlns:pic="http://schemas.openxmlformats.org/drawingml/2006/picture">
+                  <pic:nvPicPr>
+                    <pic:cNvPr id="312433678" name=""/>
+                    <pic:cNvPicPr/>
+                  </pic:nvPicPr>
+                  <pic:blipFill>
+                    <a:blip r:embed="rId15"/>
+                    <a:stretch>
+                      <a:fillRect/>
+                    </a:stretch>
+                  </pic:blipFill>
+                  <pic:spPr>
+                    <a:xfrm>
+                      <a:off x="0" y="0"/>
+                      <a:ext cx="5760720" cy="2122170"/>
+                    </a:xfrm>
+                    <a:prstGeom prst="rect">
+                      <a:avLst/>
+                    </a:prstGeom>
+                  </pic:spPr>
+                </pic:pic>
+              </a:graphicData>
+            </a:graphic>
+          </wp:inline>
+        </w:drawing>
+      </w:r>
+    </w:p>
+    <w:p>
+      <w:r>
+        <w:t>A szoftverek listáját megjelenítő oldal, ahol tudunk hozzáadni, módosítani és törölni is adatokat.</w:t>
+      </w:r>
+    </w:p>
+    <w:p>
+      <w:pPr>
+        <w:spacing w:after="120"/>
+        <w:rPr>
+          <w:b/>
+          <w:bCs/>
+        </w:rPr>
+      </w:pPr>
+      <w:r>
+        <w:rPr>
+          <w:b/>
+          <w:bCs/>
+        </w:rPr>
+        <w:t>Adatok hozzáadása</w:t>
+      </w:r>
+    </w:p>
+    <w:p>
+      <w:r>
+        <w:t>Az adatok felvétele az oldal tetején található három mezőt kitöltve, majd a „Hozzáadás” gombra kattintva történik.</w:t>
+      </w:r>
+    </w:p>
+    <w:p>
+      <w:r>
+        <w:drawing>
+          <wp:inline distT="0" distB="0" distL="0" distR="0" wp14:anchorId="1948325C" wp14:editId="34E12217">
+            <wp:extent cx="5760720" cy="314325"/>
+            <wp:effectExtent l="0" t="0" r="0" b="9525"/>
+            <wp:docPr id="2051044804" name="Kép 1"/>
+            <wp:cNvGraphicFramePr>
+              <a:graphicFrameLocks xmlns:a="http://schemas.openxmlformats.org/drawingml/2006/main" noChangeAspect="1"/>
+            </wp:cNvGraphicFramePr>
+            <a:graphic xmlns:a="http://schemas.openxmlformats.org/drawingml/2006/main">
+              <a:graphicData uri="http://schemas.openxmlformats.org/drawingml/2006/picture">
+                <pic:pic xmlns:pic="http://schemas.openxmlformats.org/drawingml/2006/picture">
+                  <pic:nvPicPr>
+                    <pic:cNvPr id="2051044804" name=""/>
+                    <pic:cNvPicPr/>
+                  </pic:nvPicPr>
+                  <pic:blipFill>
+                    <a:blip r:embed="rId16"/>
+                    <a:stretch>
+                      <a:fillRect/>
+                    </a:stretch>
+                  </pic:blipFill>
+                  <pic:spPr>
+                    <a:xfrm>
+                      <a:off x="0" y="0"/>
+                      <a:ext cx="5760720" cy="314325"/>
+                    </a:xfrm>
+                    <a:prstGeom prst="rect">
+                      <a:avLst/>
+                    </a:prstGeom>
+                  </pic:spPr>
+                </pic:pic>
+              </a:graphicData>
+            </a:graphic>
+          </wp:inline>
+        </w:drawing>
+      </w:r>
+    </w:p>
+    <w:p>
+      <w:pPr>
+        <w:spacing w:after="120"/>
+        <w:rPr>
+          <w:b/>
+          <w:bCs/>
+        </w:rPr>
+      </w:pPr>
+      <w:r>
+        <w:rPr>
+          <w:b/>
+          <w:bCs/>
+        </w:rPr>
+        <w:t>Adatok módosítása</w:t>
+      </w:r>
+    </w:p>
+    <w:p>
+      <w:r>
+        <w:drawing>
+          <wp:anchor distT="0" distB="0" distL="114300" distR="114300" simplePos="0" relativeHeight="251660288" behindDoc="0" locked="0" layoutInCell="1" allowOverlap="1" wp14:anchorId="6AF0B76E" wp14:editId="7C699D22">
+            <wp:simplePos x="0" y="0"/>
+            <wp:positionH relativeFrom="margin">
+              <wp:align>right</wp:align>
+            </wp:positionH>
+            <wp:positionV relativeFrom="paragraph">
+              <wp:posOffset>505571</wp:posOffset>
+            </wp:positionV>
+            <wp:extent cx="2481580" cy="1924050"/>
+            <wp:effectExtent l="0" t="0" r="0" b="0"/>
+            <wp:wrapSquare wrapText="bothSides"/>
+            <wp:docPr id="1692678657" name="Kép 1"/>
+            <wp:cNvGraphicFramePr>
+              <a:graphicFrameLocks xmlns:a="http://schemas.openxmlformats.org/drawingml/2006/main" noChangeAspect="1"/>
+            </wp:cNvGraphicFramePr>
+            <a:graphic xmlns:a="http://schemas.openxmlformats.org/drawingml/2006/main">
+              <a:graphicData uri="http://schemas.openxmlformats.org/drawingml/2006/picture">
+                <pic:pic xmlns:pic="http://schemas.openxmlformats.org/drawingml/2006/picture">
+                  <pic:nvPicPr>
+                    <pic:cNvPr id="1692678657" name=""/>
+                    <pic:cNvPicPr/>
+                  </pic:nvPicPr>
+                  <pic:blipFill>
+                    <a:blip r:embed="rId17">
+                      <a:extLst>
+                        <a:ext uri="{28A0092B-C50C-407E-A947-70E740481C1C}">
+                          <a14:useLocalDpi xmlns:a14="http://schemas.microsoft.com/office/drawing/2010/main" val="0"/>
+                        </a:ext>
+                      </a:extLst>
+                    </a:blip>
+                    <a:stretch>
+                      <a:fillRect/>
+                    </a:stretch>
+                  </pic:blipFill>
+                  <pic:spPr>
+                    <a:xfrm>
+                      <a:off x="0" y="0"/>
+                      <a:ext cx="2481580" cy="1924050"/>
+                    </a:xfrm>
+                    <a:prstGeom prst="rect">
+                      <a:avLst/>
+                    </a:prstGeom>
+                  </pic:spPr>
+                </pic:pic>
+              </a:graphicData>
+            </a:graphic>
+            <wp14:sizeRelH relativeFrom="margin">
+              <wp14:pctWidth>0</wp14:pctWidth>
+            </wp14:sizeRelH>
+            <wp14:sizeRelV relativeFrom="margin">
+              <wp14:pctHeight>0</wp14:pctHeight>
+            </wp14:sizeRelV>
+          </wp:anchor>
+        </w:drawing>
+      </w:r>
+      <w:r>
+        <w:drawing>
+          <wp:anchor distT="0" distB="0" distL="114300" distR="114300" simplePos="0" relativeHeight="251661312" behindDoc="0" locked="0" layoutInCell="1" allowOverlap="1" wp14:anchorId="5C612F4D" wp14:editId="4DDFB7D7">
+            <wp:simplePos x="0" y="0"/>
+            <wp:positionH relativeFrom="column">
+              <wp:posOffset>3551417</wp:posOffset>
+            </wp:positionH>
+            <wp:positionV relativeFrom="paragraph">
+              <wp:posOffset>14854</wp:posOffset>
+            </wp:positionV>
+            <wp:extent cx="1952625" cy="390525"/>
+            <wp:effectExtent l="0" t="0" r="9525" b="9525"/>
+            <wp:wrapSquare wrapText="bothSides"/>
+            <wp:docPr id="175754300" name="Kép 1"/>
+            <wp:cNvGraphicFramePr>
+              <a:graphicFrameLocks xmlns:a="http://schemas.openxmlformats.org/drawingml/2006/main" noChangeAspect="1"/>
+            </wp:cNvGraphicFramePr>
+            <a:graphic xmlns:a="http://schemas.openxmlformats.org/drawingml/2006/main">
+              <a:graphicData uri="http://schemas.openxmlformats.org/drawingml/2006/picture">
+                <pic:pic xmlns:pic="http://schemas.openxmlformats.org/drawingml/2006/picture">
+                  <pic:nvPicPr>
+                    <pic:cNvPr id="175754300" name=""/>
+                    <pic:cNvPicPr/>
+                  </pic:nvPicPr>
+                  <pic:blipFill>
+                    <a:blip r:embed="rId18">
+                      <a:extLst>
+                        <a:ext uri="{28A0092B-C50C-407E-A947-70E740481C1C}">
+                          <a14:useLocalDpi xmlns:a14="http://schemas.microsoft.com/office/drawing/2010/main" val="0"/>
+                        </a:ext>
+                      </a:extLst>
+                    </a:blip>
+                    <a:stretch>
+                      <a:fillRect/>
+                    </a:stretch>
+                  </pic:blipFill>
+                  <pic:spPr>
+                    <a:xfrm>
+                      <a:off x="0" y="0"/>
+                      <a:ext cx="1952625" cy="390525"/>
+                    </a:xfrm>
+                    <a:prstGeom prst="rect">
+                      <a:avLst/>
+                    </a:prstGeom>
+                  </pic:spPr>
+                </pic:pic>
+              </a:graphicData>
+            </a:graphic>
+          </wp:anchor>
+        </w:drawing>
+      </w:r>
+      <w:r>
+        <w:t>Minden adatnak a sorában található egy „Módosítás” gomb, amely lehetőséget nyújt az adott adatsor értékeinek változtatására. Véglegesíteni a megjelenő ablakban az alsó kék gombbal tudjuk, ha pedig mégsem szeretnénk, akkor jobb felül az X-re kattintva tudjuk bezárni.</w:t>
+      </w:r>
+      <w:r>
+        <w:t xml:space="preserve"> </w:t>
+      </w:r>
+    </w:p>
+    <w:p>
+      <w:pPr>
+        <w:spacing w:after="120"/>
+        <w:rPr>
+          <w:b/>
+          <w:bCs/>
+        </w:rPr>
+      </w:pPr>
+      <w:r>
+        <w:rPr>
+          <w:b/>
+          <w:bCs/>
+        </w:rPr>
+        <w:t>Adatok törlése</w:t>
+      </w:r>
+    </w:p>
+    <w:p>
+      <w:r>
+        <w:t>Törölni szintén az egyes adatsorokban található piros „Törlés” gombbal lehetséges, amelyre kattintva azonnal törli az abban a sorban található adatot.</w:t>
+      </w:r>
+      <w:r>
+        <w:rPr>
+          <w:noProof/>
+        </w:rPr>
+        <w:t xml:space="preserve"> </w:t>
+      </w:r>
+      <w:r>
+        <w:t xml:space="preserve"> </w:t>
+      </w:r>
+      <w:r>
+        <w:br w:type="page"/>
+      </w:r>
+    </w:p>
+    <w:p>
+      <w:pPr>
+        <w:pStyle w:val="Cmsor2"/>
+      </w:pPr>
+      <w:bookmarkStart w:id="5" w:name="_Toc226466874"/>
+      <w:r>
+        <w:lastRenderedPageBreak/>
+        <w:t>SPA menü</w:t>
+      </w:r>
+      <w:bookmarkEnd w:id="5"/>
+    </w:p>
+    <w:p>
+      <w:r>
+        <w:t xml:space="preserve">Oldal URL: </w:t>
+      </w:r>
+      <w:hyperlink r:id="rId19" w:history="1">
+        <w:r>
+          <w:rPr>
+            <w:rStyle w:val="Hiperhivatkozs"/>
+          </w:rPr>
+          <w:t>https://webprog1mged.page.gd/spa/spa.html</w:t>
+        </w:r>
+      </w:hyperlink>
+    </w:p>
+    <w:p>
+      <w:r>
+        <w:br w:type="page"/>
+      </w:r>
+    </w:p>
+    <w:p>
+      <w:pPr>
+        <w:pStyle w:val="Cmsor2"/>
+      </w:pPr>
+      <w:bookmarkStart w:id="6" w:name="_Toc226466875"/>
+      <w:r>
+        <w:lastRenderedPageBreak/>
+        <w:t>Fetch API menü</w:t>
+      </w:r>
+      <w:bookmarkEnd w:id="6"/>
+    </w:p>
+    <w:p>
+      <w:r>
+        <w:t xml:space="preserve">Oldal URL: </w:t>
+      </w:r>
+      <w:hyperlink r:id="rId20" w:history="1">
+        <w:r>
+          <w:rPr>
+            <w:rStyle w:val="Hiperhivatkozs"/>
+          </w:rPr>
+          <w:t>https://webprog1mged.page.gd/f</w:t>
+        </w:r>
+        <w:r>
+          <w:rPr>
+            <w:rStyle w:val="Hiperhivatkozs"/>
+          </w:rPr>
+          <w:t>e</w:t>
+        </w:r>
+        <w:r>
+          <w:rPr>
+            <w:rStyle w:val="Hiperhivatkozs"/>
+          </w:rPr>
+          <w:t>tchapi_crud/fetchapi.html</w:t>
+        </w:r>
+      </w:hyperlink>
+    </w:p>
+    <w:p>
+      <w:r>
+        <w:drawing>
+          <wp:inline distT="0" distB="0" distL="0" distR="0" wp14:anchorId="274C2FDE" wp14:editId="6C9F2DAC">
+            <wp:extent cx="5760720" cy="1991995"/>
+            <wp:effectExtent l="0" t="0" r="0" b="8255"/>
+            <wp:docPr id="487344459" name="Kép 1"/>
+            <wp:cNvGraphicFramePr>
+              <a:graphicFrameLocks xmlns:a="http://schemas.openxmlformats.org/drawingml/2006/main" noChangeAspect="1"/>
+            </wp:cNvGraphicFramePr>
+            <a:graphic xmlns:a="http://schemas.openxmlformats.org/drawingml/2006/main">
+              <a:graphicData uri="http://schemas.openxmlformats.org/drawingml/2006/picture">
+                <pic:pic xmlns:pic="http://schemas.openxmlformats.org/drawingml/2006/picture">
+                  <pic:nvPicPr>
+                    <pic:cNvPr id="487344459" name=""/>
+                    <pic:cNvPicPr/>
+                  </pic:nvPicPr>
+                  <pic:blipFill>
+                    <a:blip r:embed="rId21"/>
+                    <a:stretch>
+                      <a:fillRect/>
+                    </a:stretch>
+                  </pic:blipFill>
+                  <pic:spPr>
+                    <a:xfrm>
+                      <a:off x="0" y="0"/>
+                      <a:ext cx="5760720" cy="1991995"/>
+                    </a:xfrm>
+                    <a:prstGeom prst="rect">
+                      <a:avLst/>
+                    </a:prstGeom>
+                  </pic:spPr>
+                </pic:pic>
+              </a:graphicData>
+            </a:graphic>
+          </wp:inline>
+        </w:drawing>
+      </w:r>
+    </w:p>
+    <w:p>
+      <w:r>
+        <w:t>Az eddigi adatokkal dolgozó oldalaktól (JavaScript menütől, React menütől) eltérően az alábbi oldal a szerveren található adatbázis adatait jeleníti meg számunkra, amelyeket tudunk bővíteni, módosítani és törölni. Ezek már az oldal újra betöltésekor nem vesznek el.</w:t>
+      </w:r>
+    </w:p>
+    <w:p>
+      <w:pPr>
+        <w:spacing w:after="120"/>
+        <w:rPr>
+          <w:b/>
+          <w:bCs/>
+        </w:rPr>
+      </w:pPr>
+      <w:r>
+        <w:rPr>
+          <w:b/>
+          <w:bCs/>
+        </w:rPr>
+        <w:t>Új adat</w:t>
+      </w:r>
+      <w:r>
+        <w:rPr>
+          <w:b/>
+          <w:bCs/>
+        </w:rPr>
+        <w:t xml:space="preserve"> felvétele</w:t>
+      </w:r>
+    </w:p>
+    <w:p>
+      <w:r>
+        <w:t>Egy adatot felvenni a táblázat felett található két mezőt kitöltve és a „Hozzáadás” gombra kattintva tudunk.</w:t>
+      </w:r>
+    </w:p>
+    <w:p>
+      <w:pPr>
+        <w:jc w:val="center"/>
+      </w:pPr>
+      <w:r>
+        <w:drawing>
+          <wp:inline distT="0" distB="0" distL="0" distR="0" wp14:anchorId="7AC28A3B" wp14:editId="5B4C44FE">
+            <wp:extent cx="2995196" cy="252000"/>
+            <wp:effectExtent l="0" t="0" r="0" b="0"/>
+            <wp:docPr id="243387070" name="Kép 1"/>
+            <wp:cNvGraphicFramePr>
+              <a:graphicFrameLocks xmlns:a="http://schemas.openxmlformats.org/drawingml/2006/main" noChangeAspect="1"/>
+            </wp:cNvGraphicFramePr>
+            <a:graphic xmlns:a="http://schemas.openxmlformats.org/drawingml/2006/main">
+              <a:graphicData uri="http://schemas.openxmlformats.org/drawingml/2006/picture">
+                <pic:pic xmlns:pic="http://schemas.openxmlformats.org/drawingml/2006/picture">
+                  <pic:nvPicPr>
+                    <pic:cNvPr id="243387070" name=""/>
+                    <pic:cNvPicPr/>
+                  </pic:nvPicPr>
+                  <pic:blipFill>
+                    <a:blip r:embed="rId22"/>
+                    <a:stretch>
+                      <a:fillRect/>
+                    </a:stretch>
+                  </pic:blipFill>
+                  <pic:spPr>
+                    <a:xfrm>
+                      <a:off x="0" y="0"/>
+                      <a:ext cx="2995196" cy="252000"/>
+                    </a:xfrm>
+                    <a:prstGeom prst="rect">
+                      <a:avLst/>
+                    </a:prstGeom>
+                  </pic:spPr>
+                </pic:pic>
+              </a:graphicData>
+            </a:graphic>
+          </wp:inline>
+        </w:drawing>
+      </w:r>
+      <w:r>
+        <w:tab/>
+      </w:r>
+      <w:r>
+        <w:drawing>
+          <wp:inline distT="0" distB="0" distL="0" distR="0" wp14:anchorId="3107F5EB" wp14:editId="7B557432">
+            <wp:extent cx="660649" cy="252000"/>
+            <wp:effectExtent l="0" t="0" r="6350" b="0"/>
+            <wp:docPr id="981110240" name="Kép 1"/>
+            <wp:cNvGraphicFramePr>
+              <a:graphicFrameLocks xmlns:a="http://schemas.openxmlformats.org/drawingml/2006/main" noChangeAspect="1"/>
+            </wp:cNvGraphicFramePr>
+            <a:graphic xmlns:a="http://schemas.openxmlformats.org/drawingml/2006/main">
+              <a:graphicData uri="http://schemas.openxmlformats.org/drawingml/2006/picture">
+                <pic:pic xmlns:pic="http://schemas.openxmlformats.org/drawingml/2006/picture">
+                  <pic:nvPicPr>
+                    <pic:cNvPr id="981110240" name=""/>
+                    <pic:cNvPicPr/>
+                  </pic:nvPicPr>
+                  <pic:blipFill>
+                    <a:blip r:embed="rId23"/>
+                    <a:stretch>
+                      <a:fillRect/>
+                    </a:stretch>
+                  </pic:blipFill>
+                  <pic:spPr>
+                    <a:xfrm>
+                      <a:off x="0" y="0"/>
+                      <a:ext cx="660649" cy="252000"/>
+                    </a:xfrm>
+                    <a:prstGeom prst="rect">
+                      <a:avLst/>
+                    </a:prstGeom>
+                  </pic:spPr>
+                </pic:pic>
+              </a:graphicData>
+            </a:graphic>
+          </wp:inline>
+        </w:drawing>
+      </w:r>
+    </w:p>
+    <w:p>
+      <w:pPr>
+        <w:spacing w:after="120"/>
+        <w:rPr>
+          <w:b/>
+          <w:bCs/>
+        </w:rPr>
+      </w:pPr>
+      <w:r>
+        <w:rPr>
+          <w:b/>
+          <w:bCs/>
+        </w:rPr>
+        <w:t>Adatok módosítása</w:t>
+      </w:r>
+    </w:p>
+    <w:p>
+      <w:pPr>
+        <w:rPr>
+          <w:noProof/>
+        </w:rPr>
+      </w:pPr>
+      <w:r>
+        <w:drawing>
+          <wp:anchor distT="0" distB="0" distL="114300" distR="114300" simplePos="0" relativeHeight="251662336" behindDoc="0" locked="0" layoutInCell="1" allowOverlap="1" wp14:anchorId="7073D3EE" wp14:editId="66209AE1">
+            <wp:simplePos x="0" y="0"/>
+            <wp:positionH relativeFrom="margin">
+              <wp:align>right</wp:align>
+            </wp:positionH>
+            <wp:positionV relativeFrom="paragraph">
+              <wp:posOffset>10160</wp:posOffset>
+            </wp:positionV>
+            <wp:extent cx="755027" cy="288000"/>
+            <wp:effectExtent l="0" t="0" r="6985" b="0"/>
+            <wp:wrapSquare wrapText="bothSides"/>
+            <wp:docPr id="563560441" name="Kép 1"/>
+            <wp:cNvGraphicFramePr>
+              <a:graphicFrameLocks xmlns:a="http://schemas.openxmlformats.org/drawingml/2006/main" noChangeAspect="1"/>
+            </wp:cNvGraphicFramePr>
+            <a:graphic xmlns:a="http://schemas.openxmlformats.org/drawingml/2006/main">
+              <a:graphicData uri="http://schemas.openxmlformats.org/drawingml/2006/picture">
+                <pic:pic xmlns:pic="http://schemas.openxmlformats.org/drawingml/2006/picture">
+                  <pic:nvPicPr>
+                    <pic:cNvPr id="563560441" name=""/>
+                    <pic:cNvPicPr/>
+                  </pic:nvPicPr>
+                  <pic:blipFill>
+                    <a:blip r:embed="rId24">
+                      <a:extLst>
+                        <a:ext uri="{28A0092B-C50C-407E-A947-70E740481C1C}">
+                          <a14:useLocalDpi xmlns:a14="http://schemas.microsoft.com/office/drawing/2010/main" val="0"/>
+                        </a:ext>
+                      </a:extLst>
+                    </a:blip>
+                    <a:stretch>
+                      <a:fillRect/>
+                    </a:stretch>
+                  </pic:blipFill>
+                  <pic:spPr>
+                    <a:xfrm>
+                      <a:off x="0" y="0"/>
+                      <a:ext cx="755027" cy="288000"/>
+                    </a:xfrm>
+                    <a:prstGeom prst="rect">
+                      <a:avLst/>
+                    </a:prstGeom>
+                  </pic:spPr>
+                </pic:pic>
+              </a:graphicData>
+            </a:graphic>
+            <wp14:sizeRelH relativeFrom="margin">
+              <wp14:pctWidth>0</wp14:pctWidth>
+            </wp14:sizeRelH>
+            <wp14:sizeRelV relativeFrom="margin">
+              <wp14:pctHeight>0</wp14:pctHeight>
+            </wp14:sizeRelV>
+          </wp:anchor>
+        </w:drawing>
+      </w:r>
+      <w:r>
+        <w:t>A módosítani kívánt adatsorában rákattintva a „Módosítás” gombra, a sor adatai szerkeszthetővé válnak.</w:t>
+      </w:r>
+      <w:r>
+        <w:rPr>
+          <w:noProof/>
+        </w:rPr>
+        <w:t xml:space="preserve"> Miután átírtuk a szükséges adatokat, a „Megerősítés”-re kattintva a változás megtörténik.</w:t>
+      </w:r>
+    </w:p>
+    <w:p>
+      <w:pPr>
+        <w:jc w:val="center"/>
+      </w:pPr>
+      <w:r>
+        <w:drawing>
+          <wp:inline distT="0" distB="0" distL="0" distR="0" wp14:anchorId="00872B64" wp14:editId="3C3CDBC6">
+            <wp:extent cx="5760720" cy="270510"/>
+            <wp:effectExtent l="0" t="0" r="0" b="0"/>
+            <wp:docPr id="735554776" name="Kép 1"/>
+            <wp:cNvGraphicFramePr>
+              <a:graphicFrameLocks xmlns:a="http://schemas.openxmlformats.org/drawingml/2006/main" noChangeAspect="1"/>
+            </wp:cNvGraphicFramePr>
+            <a:graphic xmlns:a="http://schemas.openxmlformats.org/drawingml/2006/main">
+              <a:graphicData uri="http://schemas.openxmlformats.org/drawingml/2006/picture">
+                <pic:pic xmlns:pic="http://schemas.openxmlformats.org/drawingml/2006/picture">
+                  <pic:nvPicPr>
+                    <pic:cNvPr id="735554776" name=""/>
+                    <pic:cNvPicPr/>
+                  </pic:nvPicPr>
+                  <pic:blipFill>
+                    <a:blip r:embed="rId25"/>
+                    <a:stretch>
+                      <a:fillRect/>
+                    </a:stretch>
+                  </pic:blipFill>
+                  <pic:spPr>
+                    <a:xfrm>
+                      <a:off x="0" y="0"/>
+                      <a:ext cx="5760720" cy="270510"/>
+                    </a:xfrm>
+                    <a:prstGeom prst="rect">
+                      <a:avLst/>
+                    </a:prstGeom>
+                  </pic:spPr>
+                </pic:pic>
+              </a:graphicData>
+            </a:graphic>
+          </wp:inline>
+        </w:drawing>
+      </w:r>
+    </w:p>
+    <w:p>
+      <w:pPr>
+        <w:spacing w:after="120"/>
+      </w:pPr>
+      <w:r>
+        <w:rPr>
+          <w:b/>
+          <w:bCs/>
+        </w:rPr>
+        <w:t>Törlés</w:t>
+      </w:r>
+    </w:p>
+    <w:p>
+      <w:r>
+        <w:drawing>
+          <wp:anchor distT="0" distB="0" distL="114300" distR="114300" simplePos="0" relativeHeight="251663360" behindDoc="0" locked="0" layoutInCell="1" allowOverlap="1" wp14:anchorId="3055B28A" wp14:editId="32F9A8B8">
+            <wp:simplePos x="0" y="0"/>
+            <wp:positionH relativeFrom="margin">
+              <wp:align>right</wp:align>
+            </wp:positionH>
+            <wp:positionV relativeFrom="paragraph">
+              <wp:posOffset>6681</wp:posOffset>
+            </wp:positionV>
+            <wp:extent cx="552649" cy="288000"/>
+            <wp:effectExtent l="0" t="0" r="0" b="0"/>
+            <wp:wrapSquare wrapText="bothSides"/>
+            <wp:docPr id="841374562" name="Kép 1"/>
+            <wp:cNvGraphicFramePr>
+              <a:graphicFrameLocks xmlns:a="http://schemas.openxmlformats.org/drawingml/2006/main" noChangeAspect="1"/>
+            </wp:cNvGraphicFramePr>
+            <a:graphic xmlns:a="http://schemas.openxmlformats.org/drawingml/2006/main">
+              <a:graphicData uri="http://schemas.openxmlformats.org/drawingml/2006/picture">
+                <pic:pic xmlns:pic="http://schemas.openxmlformats.org/drawingml/2006/picture">
+                  <pic:nvPicPr>
+                    <pic:cNvPr id="841374562" name=""/>
+                    <pic:cNvPicPr/>
+                  </pic:nvPicPr>
+                  <pic:blipFill>
+                    <a:blip r:embed="rId26">
+                      <a:extLst>
+                        <a:ext uri="{28A0092B-C50C-407E-A947-70E740481C1C}">
+                          <a14:useLocalDpi xmlns:a14="http://schemas.microsoft.com/office/drawing/2010/main" val="0"/>
+                        </a:ext>
+                      </a:extLst>
+                    </a:blip>
+                    <a:stretch>
+                      <a:fillRect/>
+                    </a:stretch>
+                  </pic:blipFill>
+                  <pic:spPr>
+                    <a:xfrm>
+                      <a:off x="0" y="0"/>
+                      <a:ext cx="552649" cy="288000"/>
+                    </a:xfrm>
+                    <a:prstGeom prst="rect">
+                      <a:avLst/>
+                    </a:prstGeom>
+                  </pic:spPr>
+                </pic:pic>
+              </a:graphicData>
+            </a:graphic>
+            <wp14:sizeRelH relativeFrom="margin">
+              <wp14:pctWidth>0</wp14:pctWidth>
+            </wp14:sizeRelH>
+            <wp14:sizeRelV relativeFrom="margin">
+              <wp14:pctHeight>0</wp14:pctHeight>
+            </wp14:sizeRelV>
+          </wp:anchor>
+        </w:drawing>
+      </w:r>
+      <w:r>
+        <w:t>Minden sorban megtalálható a „Törlés” gomb, amire kattintva azonnal eltávolítja az adatsort.</w:t>
+      </w:r>
+    </w:p>
+    <w:p>
+      <w:r>
+        <w:br w:type="page"/>
+      </w:r>
+    </w:p>
+    <w:p>
+      <w:pPr>
+        <w:pStyle w:val="Cmsor2"/>
+      </w:pPr>
+      <w:bookmarkStart w:id="7" w:name="_Toc226466876"/>
+      <w:r>
+        <w:lastRenderedPageBreak/>
+        <w:t>Axios menü</w:t>
+      </w:r>
+      <w:bookmarkEnd w:id="7"/>
+    </w:p>
+    <w:p>
+      <w:r>
+        <w:t xml:space="preserve">Oldal URL: </w:t>
+      </w:r>
+      <w:hyperlink r:id="rId27" w:history="1">
+        <w:r>
+          <w:rPr>
+            <w:rStyle w:val="Hiperhivatkozs"/>
+          </w:rPr>
+          <w:t>https://webprog1mged.page.gd/axios_crud</w:t>
+        </w:r>
+      </w:hyperlink>
+    </w:p>
+    <w:p>
+      <w:r>
+        <w:drawing>
+          <wp:inline distT="0" distB="0" distL="0" distR="0" wp14:anchorId="390BC4F2" wp14:editId="33FA7083">
+            <wp:extent cx="5760720" cy="2084705"/>
+            <wp:effectExtent l="0" t="0" r="0" b="0"/>
+            <wp:docPr id="967566794" name="Kép 1"/>
+            <wp:cNvGraphicFramePr>
+              <a:graphicFrameLocks xmlns:a="http://schemas.openxmlformats.org/drawingml/2006/main" noChangeAspect="1"/>
+            </wp:cNvGraphicFramePr>
+            <a:graphic xmlns:a="http://schemas.openxmlformats.org/drawingml/2006/main">
+              <a:graphicData uri="http://schemas.openxmlformats.org/drawingml/2006/picture">
+                <pic:pic xmlns:pic="http://schemas.openxmlformats.org/drawingml/2006/picture">
+                  <pic:nvPicPr>
+                    <pic:cNvPr id="967566794" name=""/>
+                    <pic:cNvPicPr/>
+                  </pic:nvPicPr>
+                  <pic:blipFill>
+                    <a:blip r:embed="rId28"/>
+                    <a:stretch>
+                      <a:fillRect/>
+                    </a:stretch>
+                  </pic:blipFill>
+                  <pic:spPr>
+                    <a:xfrm>
+                      <a:off x="0" y="0"/>
+                      <a:ext cx="5760720" cy="2084705"/>
+                    </a:xfrm>
+                    <a:prstGeom prst="rect">
+                      <a:avLst/>
+                    </a:prstGeom>
+                  </pic:spPr>
+                </pic:pic>
+              </a:graphicData>
+            </a:graphic>
+          </wp:inline>
+        </w:drawing>
+      </w:r>
+    </w:p>
+    <w:p>
+      <w:r>
+        <w:t>Az oldal a szerver által biztosított adatokkal dolgozik, a Szoftverek táblázatában végzett tevékenységek mentésre kerülnek, így munkánk nem vész kárba.</w:t>
+      </w:r>
+    </w:p>
+    <w:p>
+      <w:pPr>
+        <w:pStyle w:val="Listaszerbekezds"/>
+        <w:numPr>
+          <w:ilvl w:val="0"/>
+          <w:numId w:val="1"/>
+        </w:numPr>
+      </w:pPr>
+      <w:r>
+        <w:rPr>
+          <w:b/>
+          <w:bCs/>
+        </w:rPr>
+        <w:t>Új adat felvétele</w:t>
+      </w:r>
+    </w:p>
+    <w:p>
+      <w:pPr>
+        <w:pStyle w:val="Listaszerbekezds"/>
+        <w:ind w:left="360"/>
+      </w:pPr>
+      <w:r>
+        <w:t>A táblázat második sorában, az „Új adat felvétele” gombra kattintva elő tudjuk hozni az adatfelvevő ablakot.</w:t>
+      </w:r>
+    </w:p>
+    <w:p>
+      <w:pPr>
+        <w:pStyle w:val="Listaszerbekezds"/>
+        <w:ind w:left="360"/>
+      </w:pPr>
+      <w:r>
+        <w:drawing>
+          <wp:inline distT="0" distB="0" distL="0" distR="0" wp14:anchorId="5C3B8A70" wp14:editId="733AE2A5">
+            <wp:extent cx="3620005" cy="257211"/>
+            <wp:effectExtent l="0" t="0" r="0" b="9525"/>
+            <wp:docPr id="1601838146" name="Kép 1"/>
+            <wp:cNvGraphicFramePr>
+              <a:graphicFrameLocks xmlns:a="http://schemas.openxmlformats.org/drawingml/2006/main" noChangeAspect="1"/>
+            </wp:cNvGraphicFramePr>
+            <a:graphic xmlns:a="http://schemas.openxmlformats.org/drawingml/2006/main">
+              <a:graphicData uri="http://schemas.openxmlformats.org/drawingml/2006/picture">
+                <pic:pic xmlns:pic="http://schemas.openxmlformats.org/drawingml/2006/picture">
+                  <pic:nvPicPr>
+                    <pic:cNvPr id="726136002" name=""/>
+                    <pic:cNvPicPr/>
+                  </pic:nvPicPr>
+                  <pic:blipFill>
+                    <a:blip r:embed="rId9"/>
+                    <a:stretch>
+                      <a:fillRect/>
+                    </a:stretch>
+                  </pic:blipFill>
+                  <pic:spPr>
+                    <a:xfrm>
+                      <a:off x="0" y="0"/>
+                      <a:ext cx="3620005" cy="257211"/>
+                    </a:xfrm>
+                    <a:prstGeom prst="rect">
+                      <a:avLst/>
+                    </a:prstGeom>
+                  </pic:spPr>
+                </pic:pic>
+              </a:graphicData>
+            </a:graphic>
+          </wp:inline>
+        </w:drawing>
+      </w:r>
+    </w:p>
+    <w:p>
+      <w:pPr>
+        <w:pStyle w:val="Listaszerbekezds"/>
+        <w:ind w:left="360"/>
+      </w:pPr>
+      <w:r>
+        <w:t>Megadva a Név és Kategória mező értékeit, majd rányomva a „Hozzáadás” gombra, az adat bekerül a listába. Bezárni a „Mégse”-re vagy egyszerűen az ablak mellé kattintva lehetséges.</w:t>
+      </w:r>
+    </w:p>
+    <w:p>
+      <w:pPr>
+        <w:pStyle w:val="Listaszerbekezds"/>
+        <w:ind w:left="360"/>
+      </w:pPr>
+      <w:r>
+        <w:drawing>
+          <wp:inline distT="0" distB="0" distL="0" distR="0" wp14:anchorId="17464ACD" wp14:editId="1C439555">
+            <wp:extent cx="2932325" cy="1080000"/>
+            <wp:effectExtent l="0" t="0" r="1905" b="6350"/>
+            <wp:docPr id="1807933682" name="Kép 1"/>
+            <wp:cNvGraphicFramePr>
+              <a:graphicFrameLocks xmlns:a="http://schemas.openxmlformats.org/drawingml/2006/main" noChangeAspect="1"/>
+            </wp:cNvGraphicFramePr>
+            <a:graphic xmlns:a="http://schemas.openxmlformats.org/drawingml/2006/main">
+              <a:graphicData uri="http://schemas.openxmlformats.org/drawingml/2006/picture">
+                <pic:pic xmlns:pic="http://schemas.openxmlformats.org/drawingml/2006/picture">
+                  <pic:nvPicPr>
+                    <pic:cNvPr id="1807933682" name=""/>
+                    <pic:cNvPicPr/>
+                  </pic:nvPicPr>
+                  <pic:blipFill>
+                    <a:blip r:embed="rId29"/>
+                    <a:stretch>
+                      <a:fillRect/>
+                    </a:stretch>
+                  </pic:blipFill>
+                  <pic:spPr>
+                    <a:xfrm>
+                      <a:off x="0" y="0"/>
+                      <a:ext cx="2932325" cy="1080000"/>
+                    </a:xfrm>
+                    <a:prstGeom prst="rect">
+                      <a:avLst/>
+                    </a:prstGeom>
+                  </pic:spPr>
+                </pic:pic>
+              </a:graphicData>
+            </a:graphic>
+          </wp:inline>
+        </w:drawing>
+      </w:r>
+    </w:p>
+    <w:p>
+      <w:pPr>
+        <w:pStyle w:val="Listaszerbekezds"/>
+        <w:numPr>
+          <w:ilvl w:val="0"/>
+          <w:numId w:val="1"/>
+        </w:numPr>
+      </w:pPr>
+      <w:r>
+        <w:rPr>
+          <w:b/>
+          <w:bCs/>
+        </w:rPr>
+        <w:t>Módosítás</w:t>
+      </w:r>
+    </w:p>
+    <w:p>
+      <w:pPr>
+        <w:pStyle w:val="Listaszerbekezds"/>
+        <w:ind w:left="360"/>
+      </w:pPr>
+      <w:r>
+        <w:t>Már meglévő adatok módosítását a sorokban megjelenő „Módosítás” gombra kattintva tudjuk megkezdeni, ahol a hozzáadáshoz hasonló ablakot kapunk.</w:t>
+      </w:r>
+    </w:p>
+    <w:p>
+      <w:pPr>
+        <w:pStyle w:val="Listaszerbekezds"/>
+        <w:ind w:left="360"/>
+      </w:pPr>
+      <w:r>
+        <w:drawing>
+          <wp:anchor distT="0" distB="0" distL="114300" distR="114300" simplePos="0" relativeHeight="251664384" behindDoc="0" locked="0" layoutInCell="1" allowOverlap="1" wp14:anchorId="6C9E9235" wp14:editId="5FF8BC9A">
+            <wp:simplePos x="0" y="0"/>
+            <wp:positionH relativeFrom="column">
+              <wp:posOffset>3384743</wp:posOffset>
+            </wp:positionH>
+            <wp:positionV relativeFrom="paragraph">
+              <wp:posOffset>682625</wp:posOffset>
+            </wp:positionV>
+            <wp:extent cx="2181529" cy="400106"/>
+            <wp:effectExtent l="0" t="0" r="0" b="0"/>
+            <wp:wrapSquare wrapText="bothSides"/>
+            <wp:docPr id="166507695" name="Kép 1"/>
+            <wp:cNvGraphicFramePr>
+              <a:graphicFrameLocks xmlns:a="http://schemas.openxmlformats.org/drawingml/2006/main" noChangeAspect="1"/>
+            </wp:cNvGraphicFramePr>
+            <a:graphic xmlns:a="http://schemas.openxmlformats.org/drawingml/2006/main">
+              <a:graphicData uri="http://schemas.openxmlformats.org/drawingml/2006/picture">
+                <pic:pic xmlns:pic="http://schemas.openxmlformats.org/drawingml/2006/picture">
+                  <pic:nvPicPr>
+                    <pic:cNvPr id="166507695" name=""/>
+                    <pic:cNvPicPr/>
+                  </pic:nvPicPr>
+                  <pic:blipFill>
+                    <a:blip r:embed="rId30">
+                      <a:extLst>
+                        <a:ext uri="{28A0092B-C50C-407E-A947-70E740481C1C}">
+                          <a14:useLocalDpi xmlns:a14="http://schemas.microsoft.com/office/drawing/2010/main" val="0"/>
+                        </a:ext>
+                      </a:extLst>
+                    </a:blip>
+                    <a:stretch>
+                      <a:fillRect/>
+                    </a:stretch>
+                  </pic:blipFill>
+                  <pic:spPr>
+                    <a:xfrm>
+                      <a:off x="0" y="0"/>
+                      <a:ext cx="2181529" cy="400106"/>
+                    </a:xfrm>
+                    <a:prstGeom prst="rect">
+                      <a:avLst/>
+                    </a:prstGeom>
+                  </pic:spPr>
+                </pic:pic>
+              </a:graphicData>
+            </a:graphic>
+          </wp:anchor>
+        </w:drawing>
+      </w:r>
+      <w:r>
+        <w:drawing>
+          <wp:inline distT="0" distB="0" distL="0" distR="0" wp14:anchorId="26446257" wp14:editId="50818D8E">
+            <wp:extent cx="2935863" cy="1080000"/>
+            <wp:effectExtent l="0" t="0" r="0" b="6350"/>
+            <wp:docPr id="807532076" name="Kép 1"/>
+            <wp:cNvGraphicFramePr>
+              <a:graphicFrameLocks xmlns:a="http://schemas.openxmlformats.org/drawingml/2006/main" noChangeAspect="1"/>
+            </wp:cNvGraphicFramePr>
+            <a:graphic xmlns:a="http://schemas.openxmlformats.org/drawingml/2006/main">
+              <a:graphicData uri="http://schemas.openxmlformats.org/drawingml/2006/picture">
+                <pic:pic xmlns:pic="http://schemas.openxmlformats.org/drawingml/2006/picture">
+                  <pic:nvPicPr>
+                    <pic:cNvPr id="807532076" name=""/>
+                    <pic:cNvPicPr/>
+                  </pic:nvPicPr>
+                  <pic:blipFill>
+                    <a:blip r:embed="rId31"/>
+                    <a:stretch>
+                      <a:fillRect/>
+                    </a:stretch>
+                  </pic:blipFill>
+                  <pic:spPr>
+                    <a:xfrm>
+                      <a:off x="0" y="0"/>
+                      <a:ext cx="2935863" cy="1080000"/>
+                    </a:xfrm>
+                    <a:prstGeom prst="rect">
+                      <a:avLst/>
+                    </a:prstGeom>
+                  </pic:spPr>
+                </pic:pic>
+              </a:graphicData>
+            </a:graphic>
+          </wp:inline>
+        </w:drawing>
+      </w:r>
+    </w:p>
+    <w:p>
+      <w:pPr>
+        <w:pStyle w:val="Listaszerbekezds"/>
+        <w:numPr>
+          <w:ilvl w:val="0"/>
+          <w:numId w:val="1"/>
+        </w:numPr>
+      </w:pPr>
+      <w:r>
+        <w:rPr>
+          <w:b/>
+          <w:bCs/>
+        </w:rPr>
+        <w:t>Törlés</w:t>
+      </w:r>
+    </w:p>
+    <w:p>
+      <w:pPr>
+        <w:pStyle w:val="Listaszerbekezds"/>
+        <w:ind w:left="360"/>
+      </w:pPr>
+      <w:r>
+        <w:t xml:space="preserve">Törölni egy adatsort a „Módosítás” melletti „Törlés” gombra kattintva </w:t>
+      </w:r>
+      <w:r>
+        <w:t>lehetséges</w:t>
+      </w:r>
+      <w:r>
+        <w:t>. Az eddigi oldalakhoz hasonlóan, itt sincs megerősítés, azonnal törli az adatot.</w:t>
+      </w:r>
+    </w:p>
+    <w:p>
+      <w:r>
+        <w:br w:type="page"/>
+      </w:r>
+    </w:p>
+    <w:p>
+      <w:pPr>
+        <w:pStyle w:val="Cmsor2"/>
+      </w:pPr>
+      <w:bookmarkStart w:id="8" w:name="_Toc226466877"/>
+      <w:r>
+        <w:lastRenderedPageBreak/>
+        <w:t>OOJS menü</w:t>
+      </w:r>
+      <w:bookmarkEnd w:id="8"/>
+    </w:p>
+    <w:p>
+      <w:r>
+        <w:t xml:space="preserve">Oldal URL: </w:t>
+      </w:r>
+      <w:hyperlink r:id="rId32" w:history="1">
+        <w:r>
+          <w:rPr>
+            <w:rStyle w:val="Hiperhivatkozs"/>
+          </w:rPr>
+          <w:t>https://webprog1mged.page.gd/oojs/oojs.html</w:t>
+        </w:r>
+      </w:hyperlink>
+    </w:p>
+    <w:p>
+      <w:r>
+        <w:t xml:space="preserve">Az oldalon a </w:t>
+      </w:r>
+      <w:r>
+        <w:t>Flappy Bird</w:t>
+      </w:r>
+      <w:r>
+        <w:t xml:space="preserve"> játék egy megvalósítását találjuk. A játék célja az eredetihez hasonlóan az, hogy a madárral átrepüljünk az oszlopok között és a lehető legtöbb pontot összeszedjük. A jelenlegi pontszámunkat a bal felső sarokban láthatjuk.</w:t>
+      </w:r>
+    </w:p>
+    <w:p>
+      <w:r>
+        <w:t>Irányítás: A madarunk alapvetően lefele esik, a szóköz billentyű vagy az egér bal klikkjének lenyomásával tudunk felfelé haladni.</w:t>
+      </w:r>
+    </w:p>
+    <w:p>
+      <w:pPr>
+        <w:jc w:val="center"/>
+      </w:pPr>
+      <w:r>
+        <w:rPr>
+          <w:noProof/>
+        </w:rPr>
+        <w:drawing>
+          <wp:inline distT="0" distB="0" distL="0" distR="0" wp14:anchorId="08654DAA" wp14:editId="0E8617B3">
+            <wp:extent cx="5040000" cy="2609444"/>
+            <wp:effectExtent l="0" t="0" r="8255" b="635"/>
+            <wp:docPr id="1787593894" name="Kép 2"/>
+            <wp:cNvGraphicFramePr>
+              <a:graphicFrameLocks xmlns:a="http://schemas.openxmlformats.org/drawingml/2006/main" noChangeAspect="1"/>
+            </wp:cNvGraphicFramePr>
+            <a:graphic xmlns:a="http://schemas.openxmlformats.org/drawingml/2006/main">
+              <a:graphicData uri="http://schemas.openxmlformats.org/drawingml/2006/picture">
+                <pic:pic xmlns:pic="http://schemas.openxmlformats.org/drawingml/2006/picture">
+                  <pic:nvPicPr>
+                    <pic:cNvPr id="0" name="Picture 3"/>
+                    <pic:cNvPicPr>
+                      <a:picLocks noChangeAspect="1" noChangeArrowheads="1"/>
+                    </pic:cNvPicPr>
+                  </pic:nvPicPr>
+                  <pic:blipFill>
+                    <a:blip r:embed="rId33" cstate="print">
+                      <a:extLst>
+                        <a:ext uri="{28A0092B-C50C-407E-A947-70E740481C1C}">
+                          <a14:useLocalDpi xmlns:a14="http://schemas.microsoft.com/office/drawing/2010/main" val="0"/>
+                        </a:ext>
+                      </a:extLst>
+                    </a:blip>
+                    <a:srcRect/>
+                    <a:stretch>
+                      <a:fillRect/>
+                    </a:stretch>
+                  </pic:blipFill>
+                  <pic:spPr bwMode="auto">
+                    <a:xfrm>
+                      <a:off x="0" y="0"/>
+                      <a:ext cx="5040000" cy="2609444"/>
+                    </a:xfrm>
+                    <a:prstGeom prst="rect">
+                      <a:avLst/>
+                    </a:prstGeom>
+                    <a:noFill/>
+                    <a:ln>
+                      <a:noFill/>
+                    </a:ln>
+                  </pic:spPr>
+                </pic:pic>
+              </a:graphicData>
+            </a:graphic>
+          </wp:inline>
+        </w:drawing>
+      </w:r>
+    </w:p>
+    <w:p>
+      <w:r>
+        <w:t>A játéknak akkor van vége, ha a játékosnak nem sikerül áthaladni a résen és neki ütközik az oszlopnak. Akkor is ez a helyzet, ha a madár leesik a földre, vagy eléri a pálya tetejét.</w:t>
+      </w:r>
+    </w:p>
+    <w:p>
+      <w:r>
+        <w:t>Végső eredményünket a kijelző közepén láthatjuk. Újra indítani a játékot a mozgáshoz hasonlóan, ahogy a „Játék vége!” képernyő is mutatja, a szóköz billentyűvel vagy az egér bal klikkjével lehetséges.</w:t>
+      </w:r>
+    </w:p>
+    <w:p>
+      <w:pPr>
+        <w:jc w:val="center"/>
+      </w:pPr>
+      <w:r>
+        <w:drawing>
+          <wp:inline distT="0" distB="0" distL="0" distR="0" wp14:anchorId="5501C217" wp14:editId="3B7F8DB5">
+            <wp:extent cx="5040000" cy="2631111"/>
+            <wp:effectExtent l="0" t="0" r="8255" b="0"/>
+            <wp:docPr id="29265952" name="Kép 1"/>
+            <wp:cNvGraphicFramePr>
+              <a:graphicFrameLocks xmlns:a="http://schemas.openxmlformats.org/drawingml/2006/main" noChangeAspect="1"/>
+            </wp:cNvGraphicFramePr>
+            <a:graphic xmlns:a="http://schemas.openxmlformats.org/drawingml/2006/main">
+              <a:graphicData uri="http://schemas.openxmlformats.org/drawingml/2006/picture">
+                <pic:pic xmlns:pic="http://schemas.openxmlformats.org/drawingml/2006/picture">
+                  <pic:nvPicPr>
+                    <pic:cNvPr id="29265952" name=""/>
+                    <pic:cNvPicPr/>
+                  </pic:nvPicPr>
+                  <pic:blipFill>
+                    <a:blip r:embed="rId34"/>
+                    <a:stretch>
+                      <a:fillRect/>
+                    </a:stretch>
+                  </pic:blipFill>
+                  <pic:spPr>
+                    <a:xfrm>
+                      <a:off x="0" y="0"/>
+                      <a:ext cx="5040000" cy="2631111"/>
+                    </a:xfrm>
+                    <a:prstGeom prst="rect">
+                      <a:avLst/>
+                    </a:prstGeom>
+                  </pic:spPr>
+                </pic:pic>
+              </a:graphicData>
+            </a:graphic>
+          </wp:inline>
+        </w:drawing>
+      </w:r>
+      <w:r>
+        <w:br w:type="page"/>
+      </w:r>
+    </w:p>
+    <w:p>
+      <w:pPr>
+        <w:pStyle w:val="Cmsor1"/>
+      </w:pPr>
+      <w:bookmarkStart w:id="9" w:name="_Fejlesztői_dokumentáció"/>
+      <w:bookmarkStart w:id="10" w:name="_Toc226466878"/>
+      <w:bookmarkEnd w:id="9"/>
+      <w:r>
+        <w:lastRenderedPageBreak/>
+        <w:t>Fejlesztői dokumentáció</w:t>
+      </w:r>
+      <w:bookmarkEnd w:id="10"/>
     </w:p>
     <w:p>
       <w:r>
@@ -46,42 +3010,29 @@
       </w:r>
     </w:p>
     <w:p>
-      <w:hyperlink r:id="rId4" w:history="1">
+      <w:hyperlink r:id="rId35" w:history="1">
         <w:r>
           <w:rPr>
             <w:rStyle w:val="Hiperhivatkozs"/>
           </w:rPr>
-          <w:t>https://github.com/red</w:t>
-        </w:r>
-        <w:r>
-          <w:rPr>
-            <w:rStyle w:val="Hiperhivatkozs"/>
-          </w:rPr>
-          <w:t>b</w:t>
-        </w:r>
-        <w:r>
-          <w:rPr>
-            <w:rStyle w:val="Hiperhivatkozs"/>
-          </w:rPr>
-          <w:t>irdjs/web1_elm_beadando</w:t>
+          <w:t>https://github.com/redbirdjs/web1_elm_beadando</w:t>
         </w:r>
       </w:hyperlink>
     </w:p>
     <w:p>
       <w:r>
-        <w:t>Tárhely</w:t>
-      </w:r>
-      <w:r>
-        <w:t xml:space="preserve"> / FTP</w:t>
-      </w:r>
-    </w:p>
-    <w:p>
-      <w:pPr>
-        <w:pStyle w:val="Cmsor1"/>
-      </w:pPr>
+        <w:t>Tárhely / FTP</w:t>
+      </w:r>
+    </w:p>
+    <w:p>
+      <w:pPr>
+        <w:pStyle w:val="Cmsor2"/>
+      </w:pPr>
+      <w:bookmarkStart w:id="11" w:name="_Toc226466879"/>
       <w:r>
         <w:t>Főoldal</w:t>
       </w:r>
+      <w:bookmarkEnd w:id="11"/>
     </w:p>
     <w:p>
       <w:r>
@@ -97,34 +3048,14 @@
       </w:r>
     </w:p>
     <w:p>
-      <w:hyperlink r:id="rId5" w:history="1">
-        <w:r>
-          <w:rPr>
-            <w:rStyle w:val="Hiperhivatkozs"/>
-          </w:rPr>
-          <w:t>https://webprog1mg</w:t>
-        </w:r>
-        <w:r>
-          <w:rPr>
-            <w:rStyle w:val="Hiperhivatkozs"/>
-          </w:rPr>
-          <w:t>e</w:t>
-        </w:r>
-        <w:r>
-          <w:rPr>
-            <w:rStyle w:val="Hiperhivatkozs"/>
-          </w:rPr>
-          <w:t>d.page.gd</w:t>
-        </w:r>
-      </w:hyperlink>
-    </w:p>
-    <w:p>
-      <w:pPr>
-        <w:pStyle w:val="Cmsor1"/>
-      </w:pPr>
+      <w:pPr>
+        <w:pStyle w:val="Cmsor2"/>
+      </w:pPr>
+      <w:bookmarkStart w:id="12" w:name="_Toc226466880"/>
       <w:r>
         <w:t>JavaScript menü</w:t>
       </w:r>
+      <w:bookmarkEnd w:id="12"/>
     </w:p>
     <w:p>
       <w:r>
@@ -132,22 +3063,14 @@
       </w:r>
     </w:p>
     <w:p>
-      <w:hyperlink r:id="rId6" w:history="1">
-        <w:r>
-          <w:rPr>
-            <w:rStyle w:val="Hiperhivatkozs"/>
-          </w:rPr>
-          <w:t>https://webprog1mged.page.gd/javascript_crud/javascript.html</w:t>
-        </w:r>
-      </w:hyperlink>
-    </w:p>
-    <w:p>
-      <w:pPr>
-        <w:pStyle w:val="Cmsor1"/>
-      </w:pPr>
+      <w:pPr>
+        <w:pStyle w:val="Cmsor2"/>
+      </w:pPr>
+      <w:bookmarkStart w:id="13" w:name="_Toc226466881"/>
       <w:r>
         <w:t>React menü</w:t>
       </w:r>
+      <w:bookmarkEnd w:id="13"/>
     </w:p>
     <w:p>
       <w:r>
@@ -155,22 +3078,14 @@
       </w:r>
     </w:p>
     <w:p>
-      <w:hyperlink r:id="rId7" w:history="1">
-        <w:r>
-          <w:rPr>
-            <w:rStyle w:val="Hiperhivatkozs"/>
-          </w:rPr>
-          <w:t>https://webprog1mged.page.gd/react_crud/react.html</w:t>
-        </w:r>
-      </w:hyperlink>
-    </w:p>
-    <w:p>
-      <w:pPr>
-        <w:pStyle w:val="Cmsor1"/>
-      </w:pPr>
+      <w:pPr>
+        <w:pStyle w:val="Cmsor2"/>
+      </w:pPr>
+      <w:bookmarkStart w:id="14" w:name="_Toc226466882"/>
       <w:r>
         <w:t>SPA menü</w:t>
       </w:r>
+      <w:bookmarkEnd w:id="14"/>
     </w:p>
     <w:p>
       <w:r>
@@ -178,22 +3093,14 @@
       </w:r>
     </w:p>
     <w:p>
-      <w:hyperlink r:id="rId8" w:history="1">
-        <w:r>
-          <w:rPr>
-            <w:rStyle w:val="Hiperhivatkozs"/>
-          </w:rPr>
-          <w:t>https://webprog1mged.page.gd/spa/spa.html</w:t>
-        </w:r>
-      </w:hyperlink>
-    </w:p>
-    <w:p>
-      <w:pPr>
-        <w:pStyle w:val="Cmsor1"/>
-      </w:pPr>
+      <w:pPr>
+        <w:pStyle w:val="Cmsor2"/>
+      </w:pPr>
+      <w:bookmarkStart w:id="15" w:name="_Toc226466883"/>
       <w:r>
         <w:t>Fetch API menü</w:t>
       </w:r>
+      <w:bookmarkEnd w:id="15"/>
     </w:p>
     <w:p>
       <w:r>
@@ -201,26 +3108,23 @@
       </w:r>
       <w:r>
         <w:br/>
-        <w:t>backend: php/backend.php</w:t>
-      </w:r>
-    </w:p>
-    <w:p>
-      <w:hyperlink r:id="rId9" w:history="1">
-        <w:r>
-          <w:rPr>
-            <w:rStyle w:val="Hiperhivatkozs"/>
-          </w:rPr>
-          <w:t>https://webprog1mged.page.gd/fetchapi_crud/fetchapi.html</w:t>
-        </w:r>
-      </w:hyperlink>
-    </w:p>
-    <w:p>
-      <w:pPr>
-        <w:pStyle w:val="Cmsor1"/>
-      </w:pPr>
+        <w:t>backend: php/</w:t>
+      </w:r>
+      <w:proofErr w:type="spellStart"/>
+      <w:r>
+        <w:t>backend.php</w:t>
+      </w:r>
+      <w:proofErr w:type="spellEnd"/>
+    </w:p>
+    <w:p>
+      <w:pPr>
+        <w:pStyle w:val="Cmsor2"/>
+      </w:pPr>
+      <w:bookmarkStart w:id="16" w:name="_Toc226466884"/>
       <w:r>
         <w:t>Axios menü</w:t>
       </w:r>
+      <w:bookmarkEnd w:id="16"/>
     </w:p>
     <w:p>
       <w:r>
@@ -230,42 +3134,30 @@
         <w:br/>
       </w:r>
       <w:r>
-        <w:t>backend: php/backend.php</w:t>
-      </w:r>
-    </w:p>
-    <w:p>
-      <w:hyperlink r:id="rId10" w:history="1">
-        <w:r>
-          <w:rPr>
-            <w:rStyle w:val="Hiperhivatkozs"/>
-          </w:rPr>
-          <w:t>https://webprog1mged.page.gd/axios_crud</w:t>
-        </w:r>
-      </w:hyperlink>
-    </w:p>
-    <w:p>
-      <w:pPr>
-        <w:pStyle w:val="Cmsor1"/>
-      </w:pPr>
+        <w:t>backend: php/</w:t>
+      </w:r>
+      <w:proofErr w:type="spellStart"/>
+      <w:r>
+        <w:t>backend.php</w:t>
+      </w:r>
+      <w:proofErr w:type="spellEnd"/>
+    </w:p>
+    <w:p>
+      <w:pPr>
+        <w:pStyle w:val="Cmsor2"/>
+      </w:pPr>
+      <w:bookmarkStart w:id="17" w:name="_Toc226466885"/>
       <w:r>
         <w:t>OOJS menü</w:t>
       </w:r>
+      <w:bookmarkEnd w:id="17"/>
     </w:p>
     <w:p>
       <w:r>
         <w:t>7_oojs</w:t>
       </w:r>
     </w:p>
-    <w:p>
-      <w:hyperlink r:id="rId11" w:history="1">
-        <w:r>
-          <w:rPr>
-            <w:rStyle w:val="Hiperhivatkozs"/>
-          </w:rPr>
-          <w:t>https://webprog1mged.page.gd/oojs/oojs.html</w:t>
-        </w:r>
-      </w:hyperlink>
-    </w:p>
+    <w:p/>
     <w:sectPr>
       <w:pgSz w:w="11906" w:h="16838"/>
       <w:pgMar w:top="1417" w:right="1417" w:bottom="1417" w:left="1417" w:header="708" w:footer="708" w:gutter="0"/>
@@ -274,6 +3166,126 @@
     </w:sectPr>
   </w:body>
 </w:document>
+</file>
+
+<file path=word/numbering.xml><?xml version="1.0" encoding="utf-8"?>
+<w:numbering xmlns:wpc="http://schemas.microsoft.com/office/word/2010/wordprocessingCanvas" xmlns:cx="http://schemas.microsoft.com/office/drawing/2014/chartex" xmlns:cx1="http://schemas.microsoft.com/office/drawing/2015/9/8/chartex" xmlns:cx2="http://schemas.microsoft.com/office/drawing/2015/10/21/chartex" xmlns:cx3="http://schemas.microsoft.com/office/drawing/2016/5/9/chartex" xmlns:cx4="http://schemas.microsoft.com/office/drawing/2016/5/10/chartex" xmlns:cx5="http://schemas.microsoft.com/office/drawing/2016/5/11/chartex" xmlns:cx6="http://schemas.microsoft.com/office/drawing/2016/5/12/chartex" xmlns:cx7="http://schemas.microsoft.com/office/drawing/2016/5/13/chartex" xmlns:cx8="http://schemas.microsoft.com/office/drawing/2016/5/14/chartex" xmlns:mc="http://schemas.openxmlformats.org/markup-compatibility/2006" xmlns:aink="http://schemas.microsoft.com/office/drawing/2016/ink" xmlns:am3d="http://schemas.microsoft.com/office/drawing/2017/model3d" xmlns:o="urn:schemas-microsoft-com:office:office" xmlns:oel="http://schemas.microsoft.com/office/2019/extlst" xmlns:r="http://schemas.openxmlformats.org/officeDocument/2006/relationships" xmlns:m="http://schemas.openxmlformats.org/officeDocument/2006/math" xmlns:v="urn:schemas-microsoft-com:vml" xmlns:wp14="http://schemas.microsoft.com/office/word/2010/wordprocessingDrawing" xmlns:wp="http://schemas.openxmlformats.org/drawingml/2006/wordprocessingDrawing" xmlns:w10="urn:schemas-microsoft-com:office:word" xmlns:w="http://schemas.openxmlformats.org/wordprocessingml/2006/main" xmlns:w14="http://schemas.microsoft.com/office/word/2010/wordml" xmlns:w15="http://schemas.microsoft.com/office/word/2012/wordml" xmlns:w16cex="http://schemas.microsoft.com/office/word/2018/wordml/cex" xmlns:w16cid="http://schemas.microsoft.com/office/word/2016/wordml/cid" xmlns:w16="http://schemas.microsoft.com/office/word/2018/wordml" xmlns:w16du="http://schemas.microsoft.com/office/word/2023/wordml/word16du" xmlns:w16sdtdh="http://schemas.microsoft.com/office/word/2020/wordml/sdtdatahash" xmlns:w16sdtfl="http://schemas.microsoft.com/office/word/2024/wordml/sdtformatlock" xmlns:w16se="http://schemas.microsoft.com/office/word/2015/wordml/symex" xmlns:wpg="http://schemas.microsoft.com/office/word/2010/wordprocessingGroup" xmlns:wpi="http://schemas.microsoft.com/office/word/2010/wordprocessingInk" xmlns:wne="http://schemas.microsoft.com/office/word/2006/wordml" xmlns:wps="http://schemas.microsoft.com/office/word/2010/wordprocessingShape" mc:Ignorable="w14 w15 w16se w16cid w16 w16cex w16sdtdh w16sdtfl w16du wp14">
+  <w:abstractNum w:abstractNumId="0" w15:restartNumberingAfterBreak="0">
+    <w:nsid w:val="60100BD5"/>
+    <w:multiLevelType w:val="hybridMultilevel"/>
+    <w:tmpl w:val="6DCCAEE4"/>
+    <w:lvl w:ilvl="0" w:tplc="896ED282">
+      <w:numFmt w:val="bullet"/>
+      <w:lvlText w:val="-"/>
+      <w:lvlJc w:val="left"/>
+      <w:pPr>
+        <w:ind w:left="360" w:hanging="360"/>
+      </w:pPr>
+      <w:rPr>
+        <w:rFonts w:ascii="Aptos" w:eastAsiaTheme="minorHAnsi" w:hAnsi="Aptos" w:cstheme="minorBidi" w:hint="default"/>
+      </w:rPr>
+    </w:lvl>
+    <w:lvl w:ilvl="1" w:tplc="040E0003" w:tentative="1">
+      <w:start w:val="1"/>
+      <w:numFmt w:val="bullet"/>
+      <w:lvlText w:val="o"/>
+      <w:lvlJc w:val="left"/>
+      <w:pPr>
+        <w:ind w:left="1080" w:hanging="360"/>
+      </w:pPr>
+      <w:rPr>
+        <w:rFonts w:ascii="Courier New" w:hAnsi="Courier New" w:cs="Courier New" w:hint="default"/>
+      </w:rPr>
+    </w:lvl>
+    <w:lvl w:ilvl="2" w:tplc="040E0005" w:tentative="1">
+      <w:start w:val="1"/>
+      <w:numFmt w:val="bullet"/>
+      <w:lvlText w:val=""/>
+      <w:lvlJc w:val="left"/>
+      <w:pPr>
+        <w:ind w:left="1800" w:hanging="360"/>
+      </w:pPr>
+      <w:rPr>
+        <w:rFonts w:ascii="Wingdings" w:hAnsi="Wingdings" w:hint="default"/>
+      </w:rPr>
+    </w:lvl>
+    <w:lvl w:ilvl="3" w:tplc="040E0001" w:tentative="1">
+      <w:start w:val="1"/>
+      <w:numFmt w:val="bullet"/>
+      <w:lvlText w:val=""/>
+      <w:lvlJc w:val="left"/>
+      <w:pPr>
+        <w:ind w:left="2520" w:hanging="360"/>
+      </w:pPr>
+      <w:rPr>
+        <w:rFonts w:ascii="Symbol" w:hAnsi="Symbol" w:hint="default"/>
+      </w:rPr>
+    </w:lvl>
+    <w:lvl w:ilvl="4" w:tplc="040E0003" w:tentative="1">
+      <w:start w:val="1"/>
+      <w:numFmt w:val="bullet"/>
+      <w:lvlText w:val="o"/>
+      <w:lvlJc w:val="left"/>
+      <w:pPr>
+        <w:ind w:left="3240" w:hanging="360"/>
+      </w:pPr>
+      <w:rPr>
+        <w:rFonts w:ascii="Courier New" w:hAnsi="Courier New" w:cs="Courier New" w:hint="default"/>
+      </w:rPr>
+    </w:lvl>
+    <w:lvl w:ilvl="5" w:tplc="040E0005" w:tentative="1">
+      <w:start w:val="1"/>
+      <w:numFmt w:val="bullet"/>
+      <w:lvlText w:val=""/>
+      <w:lvlJc w:val="left"/>
+      <w:pPr>
+        <w:ind w:left="3960" w:hanging="360"/>
+      </w:pPr>
+      <w:rPr>
+        <w:rFonts w:ascii="Wingdings" w:hAnsi="Wingdings" w:hint="default"/>
+      </w:rPr>
+    </w:lvl>
+    <w:lvl w:ilvl="6" w:tplc="040E0001" w:tentative="1">
+      <w:start w:val="1"/>
+      <w:numFmt w:val="bullet"/>
+      <w:lvlText w:val=""/>
+      <w:lvlJc w:val="left"/>
+      <w:pPr>
+        <w:ind w:left="4680" w:hanging="360"/>
+      </w:pPr>
+      <w:rPr>
+        <w:rFonts w:ascii="Symbol" w:hAnsi="Symbol" w:hint="default"/>
+      </w:rPr>
+    </w:lvl>
+    <w:lvl w:ilvl="7" w:tplc="040E0003" w:tentative="1">
+      <w:start w:val="1"/>
+      <w:numFmt w:val="bullet"/>
+      <w:lvlText w:val="o"/>
+      <w:lvlJc w:val="left"/>
+      <w:pPr>
+        <w:ind w:left="5400" w:hanging="360"/>
+      </w:pPr>
+      <w:rPr>
+        <w:rFonts w:ascii="Courier New" w:hAnsi="Courier New" w:cs="Courier New" w:hint="default"/>
+      </w:rPr>
+    </w:lvl>
+    <w:lvl w:ilvl="8" w:tplc="040E0005" w:tentative="1">
+      <w:start w:val="1"/>
+      <w:numFmt w:val="bullet"/>
+      <w:lvlText w:val=""/>
+      <w:lvlJc w:val="left"/>
+      <w:pPr>
+        <w:ind w:left="6120" w:hanging="360"/>
+      </w:pPr>
+      <w:rPr>
+        <w:rFonts w:ascii="Wingdings" w:hAnsi="Wingdings" w:hint="default"/>
+      </w:rPr>
+    </w:lvl>
+  </w:abstractNum>
+  <w:num w:numId="1" w16cid:durableId="336856378">
+    <w:abstractNumId w:val="0"/>
+  </w:num>
+</w:numbering>
 </file>
 
 <file path=word/styles.xml><?xml version="1.0" encoding="utf-8"?>
@@ -684,18 +3696,21 @@
     <w:link w:val="Cmsor1Char"/>
     <w:uiPriority w:val="9"/>
     <w:qFormat/>
-    <w:rsid w:val="00E55343"/>
+    <w:rsid w:val="00883C49"/>
     <w:pPr>
       <w:keepNext/>
       <w:keepLines/>
-      <w:spacing w:before="360" w:after="80"/>
+      <w:pBdr>
+        <w:bottom w:val="single" w:sz="4" w:space="1" w:color="auto"/>
+      </w:pBdr>
+      <w:spacing w:before="360" w:after="240"/>
       <w:outlineLvl w:val="0"/>
     </w:pPr>
     <w:rPr>
       <w:rFonts w:asciiTheme="majorHAnsi" w:eastAsiaTheme="majorEastAsia" w:hAnsiTheme="majorHAnsi" w:cstheme="majorBidi"/>
       <w:b/>
       <w:color w:val="000000" w:themeColor="text1"/>
-      <w:sz w:val="32"/>
+      <w:sz w:val="36"/>
       <w:szCs w:val="40"/>
     </w:rPr>
   </w:style>
@@ -705,19 +3720,19 @@
     <w:next w:val="Norml"/>
     <w:link w:val="Cmsor2Char"/>
     <w:uiPriority w:val="9"/>
-    <w:semiHidden/>
     <w:unhideWhenUsed/>
     <w:qFormat/>
-    <w:rsid w:val="00B11C2E"/>
+    <w:rsid w:val="00883C49"/>
     <w:pPr>
       <w:keepNext/>
       <w:keepLines/>
-      <w:spacing w:before="160" w:after="80"/>
+      <w:spacing w:before="240" w:after="80"/>
       <w:outlineLvl w:val="1"/>
     </w:pPr>
     <w:rPr>
       <w:rFonts w:asciiTheme="majorHAnsi" w:eastAsiaTheme="majorEastAsia" w:hAnsiTheme="majorHAnsi" w:cstheme="majorBidi"/>
-      <w:color w:val="0F4761" w:themeColor="accent1" w:themeShade="BF"/>
+      <w:b/>
+      <w:color w:val="000000" w:themeColor="text1"/>
       <w:sz w:val="32"/>
       <w:szCs w:val="32"/>
     </w:rPr>
@@ -880,7 +3895,6 @@
   <w:style w:type="character" w:default="1" w:styleId="Bekezdsalapbettpusa">
     <w:name w:val="Default Paragraph Font"/>
     <w:uiPriority w:val="1"/>
-    <w:semiHidden/>
     <w:unhideWhenUsed/>
   </w:style>
   <w:style w:type="table" w:default="1" w:styleId="Normltblzat">
@@ -909,12 +3923,12 @@
     <w:basedOn w:val="Bekezdsalapbettpusa"/>
     <w:link w:val="Cmsor1"/>
     <w:uiPriority w:val="9"/>
-    <w:rsid w:val="00E55343"/>
+    <w:rsid w:val="00883C49"/>
     <w:rPr>
       <w:rFonts w:asciiTheme="majorHAnsi" w:eastAsiaTheme="majorEastAsia" w:hAnsiTheme="majorHAnsi" w:cstheme="majorBidi"/>
       <w:b/>
       <w:color w:val="000000" w:themeColor="text1"/>
-      <w:sz w:val="32"/>
+      <w:sz w:val="36"/>
       <w:szCs w:val="40"/>
     </w:rPr>
   </w:style>
@@ -923,11 +3937,11 @@
     <w:basedOn w:val="Bekezdsalapbettpusa"/>
     <w:link w:val="Cmsor2"/>
     <w:uiPriority w:val="9"/>
-    <w:semiHidden/>
-    <w:rsid w:val="00B11C2E"/>
+    <w:rsid w:val="00883C49"/>
     <w:rPr>
       <w:rFonts w:asciiTheme="majorHAnsi" w:eastAsiaTheme="majorEastAsia" w:hAnsiTheme="majorHAnsi" w:cstheme="majorBidi"/>
-      <w:color w:val="0F4761" w:themeColor="accent1" w:themeShade="BF"/>
+      <w:b/>
+      <w:color w:val="000000" w:themeColor="text1"/>
       <w:sz w:val="32"/>
       <w:szCs w:val="32"/>
     </w:rPr>
@@ -1229,6 +4243,31 @@
       <w:color w:val="96607D" w:themeColor="followedHyperlink"/>
       <w:u w:val="single"/>
     </w:rPr>
+  </w:style>
+  <w:style w:type="paragraph" w:styleId="TJ1">
+    <w:name w:val="toc 1"/>
+    <w:basedOn w:val="Norml"/>
+    <w:next w:val="Norml"/>
+    <w:autoRedefine/>
+    <w:uiPriority w:val="39"/>
+    <w:unhideWhenUsed/>
+    <w:rsid w:val="00883C49"/>
+    <w:pPr>
+      <w:spacing w:after="100"/>
+    </w:pPr>
+  </w:style>
+  <w:style w:type="paragraph" w:styleId="TJ2">
+    <w:name w:val="toc 2"/>
+    <w:basedOn w:val="Norml"/>
+    <w:next w:val="Norml"/>
+    <w:autoRedefine/>
+    <w:uiPriority w:val="39"/>
+    <w:unhideWhenUsed/>
+    <w:rsid w:val="00883C49"/>
+    <w:pPr>
+      <w:spacing w:after="100"/>
+      <w:ind w:left="240"/>
+    </w:pPr>
   </w:style>
 </w:styles>
 </file>
@@ -1546,4 +4585,16 @@
     </a:ext>
   </a:extLst>
 </a:theme>
+</file>
+
+<file path=customXml/item1.xml><?xml version="1.0" encoding="utf-8"?>
+<b:Sources xmlns:b="http://schemas.openxmlformats.org/officeDocument/2006/bibliography" xmlns="http://schemas.openxmlformats.org/officeDocument/2006/bibliography" SelectedStyle="\APASixthEditionOfficeOnline.xsl" StyleName="APA" Version="6"/>
+</file>
+
+<file path=customXml/itemProps1.xml><?xml version="1.0" encoding="utf-8"?>
+<ds:datastoreItem xmlns:ds="http://schemas.openxmlformats.org/officeDocument/2006/customXml" ds:itemID="{4315EFD1-8499-42B0-9E15-6F01C61495B2}">
+  <ds:schemaRefs>
+    <ds:schemaRef ds:uri="http://schemas.openxmlformats.org/officeDocument/2006/bibliography"/>
+  </ds:schemaRefs>
+</ds:datastoreItem>
 </file>
</xml_diff>